<commit_message>
docs: add AI service architecture documentation
</commit_message>
<xml_diff>
--- a/docs/Day15_AI_Service_Architecture.docx
+++ b/docs/Day15_AI_Service_Architecture.docx
@@ -30,29 +30,7 @@
           <w:sz w:val="40"/>
           <w:szCs w:val="40"/>
         </w:rPr>
-        <w:t xml:space="preserve">AI Service &amp; </w:t>
-      </w:r>
-      <w:proofErr w:type="spellStart"/>
-      <w:r>
-        <w:rPr>
-          <w:b/>
-          <w:bCs/>
-          <w:color w:val="1B2430"/>
-          <w:sz w:val="40"/>
-          <w:szCs w:val="40"/>
-        </w:rPr>
-        <w:t>FastAPI</w:t>
-      </w:r>
-      <w:proofErr w:type="spellEnd"/>
-      <w:r>
-        <w:rPr>
-          <w:b/>
-          <w:bCs/>
-          <w:color w:val="1B2430"/>
-          <w:sz w:val="40"/>
-          <w:szCs w:val="40"/>
-        </w:rPr>
-        <w:t xml:space="preserve"> Architecture</w:t>
+        <w:t>AI Service &amp; FastAPI Architecture</w:t>
       </w:r>
     </w:p>
     <w:p>
@@ -67,29 +45,7 @@
           <w:sz w:val="22"/>
           <w:szCs w:val="22"/>
         </w:rPr>
-        <w:t xml:space="preserve">Service structure, endpoint planning, and integration boundaries for </w:t>
-      </w:r>
-      <w:proofErr w:type="spellStart"/>
-      <w:r>
-        <w:rPr>
-          <w:i/>
-          <w:iCs/>
-          <w:color w:val="5A6478"/>
-          <w:sz w:val="22"/>
-          <w:szCs w:val="22"/>
-        </w:rPr>
-        <w:t>hisabdo</w:t>
-      </w:r>
-      <w:proofErr w:type="spellEnd"/>
-      <w:r>
-        <w:rPr>
-          <w:i/>
-          <w:iCs/>
-          <w:color w:val="5A6478"/>
-          <w:sz w:val="22"/>
-          <w:szCs w:val="22"/>
-        </w:rPr>
-        <w:t>-webapp-ai</w:t>
+        <w:t>Service structure, endpoint planning, and integration boundaries for HisabDo-webapp-ai</w:t>
       </w:r>
     </w:p>
     <w:tbl>
@@ -114,12 +70,6 @@
         <w:gridCol w:w="6740"/>
       </w:tblGrid>
       <w:tr>
-        <w:tblPrEx>
-          <w:tblCellMar>
-            <w:top w:w="0" w:type="dxa"/>
-            <w:bottom w:w="0" w:type="dxa"/>
-          </w:tblCellMar>
-        </w:tblPrEx>
         <w:tc>
           <w:tcPr>
             <w:tcW w:w="2800" w:type="dxa"/>
@@ -155,32 +105,17 @@
             </w:tcMar>
           </w:tcPr>
           <w:p>
-            <w:proofErr w:type="spellStart"/>
             <w:r>
               <w:rPr>
                 <w:sz w:val="20"/>
                 <w:szCs w:val="20"/>
               </w:rPr>
-              <w:t>Hisabdo</w:t>
-            </w:r>
-            <w:proofErr w:type="spellEnd"/>
-            <w:r>
-              <w:rPr>
-                <w:sz w:val="20"/>
-                <w:szCs w:val="20"/>
-              </w:rPr>
-              <w:t xml:space="preserve"> Web App — AI Service</w:t>
+              <w:t>HisabDo Web App — AI Service</w:t>
             </w:r>
           </w:p>
         </w:tc>
       </w:tr>
       <w:tr>
-        <w:tblPrEx>
-          <w:tblCellMar>
-            <w:top w:w="0" w:type="dxa"/>
-            <w:bottom w:w="0" w:type="dxa"/>
-          </w:tblCellMar>
-        </w:tblPrEx>
         <w:tc>
           <w:tcPr>
             <w:tcW w:w="2800" w:type="dxa"/>
@@ -221,34 +156,12 @@
                 <w:sz w:val="20"/>
                 <w:szCs w:val="20"/>
               </w:rPr>
-              <w:t>usmankhalid172/</w:t>
-            </w:r>
-            <w:proofErr w:type="spellStart"/>
-            <w:r>
-              <w:rPr>
-                <w:sz w:val="20"/>
-                <w:szCs w:val="20"/>
-              </w:rPr>
-              <w:t>hisabdo</w:t>
-            </w:r>
-            <w:proofErr w:type="spellEnd"/>
-            <w:r>
-              <w:rPr>
-                <w:sz w:val="20"/>
-                <w:szCs w:val="20"/>
-              </w:rPr>
-              <w:t>-webapp-ai</w:t>
+              <w:t>usmankhalid172/HisabDo-webapp-ai</w:t>
             </w:r>
           </w:p>
         </w:tc>
       </w:tr>
       <w:tr>
-        <w:tblPrEx>
-          <w:tblCellMar>
-            <w:top w:w="0" w:type="dxa"/>
-            <w:bottom w:w="0" w:type="dxa"/>
-          </w:tblCellMar>
-        </w:tblPrEx>
         <w:tc>
           <w:tcPr>
             <w:tcW w:w="2800" w:type="dxa"/>
@@ -295,12 +208,6 @@
         </w:tc>
       </w:tr>
       <w:tr>
-        <w:tblPrEx>
-          <w:tblCellMar>
-            <w:top w:w="0" w:type="dxa"/>
-            <w:bottom w:w="0" w:type="dxa"/>
-          </w:tblCellMar>
-        </w:tblPrEx>
         <w:tc>
           <w:tcPr>
             <w:tcW w:w="2800" w:type="dxa"/>
@@ -341,34 +248,12 @@
                 <w:sz w:val="20"/>
                 <w:szCs w:val="20"/>
               </w:rPr>
-              <w:t xml:space="preserve">Define the overall AI service / </w:t>
-            </w:r>
-            <w:proofErr w:type="spellStart"/>
-            <w:r>
-              <w:rPr>
-                <w:sz w:val="20"/>
-                <w:szCs w:val="20"/>
-              </w:rPr>
-              <w:t>FastAPI</w:t>
-            </w:r>
-            <w:proofErr w:type="spellEnd"/>
-            <w:r>
-              <w:rPr>
-                <w:sz w:val="20"/>
-                <w:szCs w:val="20"/>
-              </w:rPr>
-              <w:t xml:space="preserve"> architecture and integration boundaries</w:t>
+              <w:t>Define the overall AI service / FastAPI architecture and integration boundaries</w:t>
             </w:r>
           </w:p>
         </w:tc>
       </w:tr>
       <w:tr>
-        <w:tblPrEx>
-          <w:tblCellMar>
-            <w:top w:w="0" w:type="dxa"/>
-            <w:bottom w:w="0" w:type="dxa"/>
-          </w:tblCellMar>
-        </w:tblPrEx>
         <w:tc>
           <w:tcPr>
             <w:tcW w:w="2800" w:type="dxa"/>
@@ -415,12 +300,6 @@
         </w:tc>
       </w:tr>
       <w:tr>
-        <w:tblPrEx>
-          <w:tblCellMar>
-            <w:top w:w="0" w:type="dxa"/>
-            <w:bottom w:w="0" w:type="dxa"/>
-          </w:tblCellMar>
-        </w:tblPrEx>
         <w:tc>
           <w:tcPr>
             <w:tcW w:w="2800" w:type="dxa"/>
@@ -467,12 +346,6 @@
         </w:tc>
       </w:tr>
       <w:tr>
-        <w:tblPrEx>
-          <w:tblCellMar>
-            <w:top w:w="0" w:type="dxa"/>
-            <w:bottom w:w="0" w:type="dxa"/>
-          </w:tblCellMar>
-        </w:tblPrEx>
         <w:tc>
           <w:tcPr>
             <w:tcW w:w="2800" w:type="dxa"/>
@@ -552,23 +425,7 @@
         <w:spacing w:after="160" w:line="300" w:lineRule="auto"/>
       </w:pPr>
       <w:r>
-        <w:t xml:space="preserve">This document defines the target architecture for the AI service that powers </w:t>
-      </w:r>
-      <w:proofErr w:type="spellStart"/>
-      <w:r>
-        <w:t>Hisabdo's</w:t>
-      </w:r>
-      <w:proofErr w:type="spellEnd"/>
-      <w:r>
-        <w:t xml:space="preserve"> chatbot and automatic expense-categorization features. It sets out where </w:t>
-      </w:r>
-      <w:proofErr w:type="spellStart"/>
-      <w:r>
-        <w:t>FastAPI</w:t>
-      </w:r>
-      <w:proofErr w:type="spellEnd"/>
-      <w:r>
-        <w:t xml:space="preserve"> endpoints live, the boundary between the AI service and the main application backend, how the two chatbot and categorization capabilities are mapped to that structure, and the shared contracts both sides need to respect before implementation begins.</w:t>
+        <w:t>This document defines the target architecture for the AI service that powers HisabDo's chatbot and automatic expense-categorization features. It sets out where FastAPI endpoints live, the boundary between the AI service and the main application backend, how the two chatbot and categorization capabilities are mapped to that structure, and the shared contracts both sides need to respect before implementation begins.</w:t>
       </w:r>
     </w:p>
     <w:p>
@@ -576,15 +433,7 @@
         <w:spacing w:after="160" w:line="300" w:lineRule="auto"/>
       </w:pPr>
       <w:r>
-        <w:t xml:space="preserve">Scope for Day 15 is planning and structure only: no service code </w:t>
-      </w:r>
-      <w:proofErr w:type="gramStart"/>
-      <w:r>
-        <w:t>is</w:t>
-      </w:r>
-      <w:proofErr w:type="gramEnd"/>
-      <w:r>
-        <w:t xml:space="preserve"> implemented yet. This document is the reference other implementation days (Day 16+) will build against.</w:t>
+        <w:t>Scope for Day 15 is planning and structure only: no service code is implemented yet. This document is the reference other implementation days (Day 16+) will build against.</w:t>
       </w:r>
     </w:p>
     <w:p>
@@ -615,21 +464,8 @@
         </w:numPr>
         <w:spacing w:after="80" w:line="290" w:lineRule="auto"/>
       </w:pPr>
-      <w:proofErr w:type="spellStart"/>
-      <w:r>
-        <w:t>hisabdo</w:t>
-      </w:r>
-      <w:proofErr w:type="spellEnd"/>
-      <w:r>
-        <w:t xml:space="preserve">-webapp-ai is treated as an independent microservice repository, separate from the main </w:t>
-      </w:r>
-      <w:proofErr w:type="spellStart"/>
-      <w:r>
-        <w:t>Hisabdo</w:t>
-      </w:r>
-      <w:proofErr w:type="spellEnd"/>
-      <w:r>
-        <w:t xml:space="preserve"> application backend repository.</w:t>
+      <w:r>
+        <w:t>HisabDo-webapp-ai is treated as an independent microservice repository, separate from the main HisabDo application backend repository.</w:t>
       </w:r>
     </w:p>
     <w:p>
@@ -642,15 +478,7 @@
         <w:spacing w:after="80" w:line="290" w:lineRule="auto"/>
       </w:pPr>
       <w:r>
-        <w:t xml:space="preserve">The AI service talks to the application backend only over an internal REST API (JSON over </w:t>
-      </w:r>
-      <w:proofErr w:type="gramStart"/>
-      <w:r>
-        <w:t>HTTPS) —</w:t>
-      </w:r>
-      <w:proofErr w:type="gramEnd"/>
-      <w:r>
-        <w:t xml:space="preserve"> no shared database access, and no direct calls from the frontend/client.</w:t>
+        <w:t>The AI service talks to the application backend only over an internal REST API (JSON over HTTPS) — no shared database access, and no direct calls from the frontend/client.</w:t>
       </w:r>
     </w:p>
     <w:p>
@@ -663,19 +491,6 @@
         <w:spacing w:after="80" w:line="290" w:lineRule="auto"/>
       </w:pPr>
       <w:r>
-        <w:t>The final PR target branch and merge approval are pending confirmation from Team Leads, per the docs-branch clarification noted in the workflow instructions; this document assumes the repository's standard main/develop convention until that is confirmed.</w:t>
-      </w:r>
-    </w:p>
-    <w:p>
-      <w:pPr>
-        <w:pStyle w:val="ListParagraph"/>
-        <w:numPr>
-          <w:ilvl w:val="0"/>
-          <w:numId w:val="2"/>
-        </w:numPr>
-        <w:spacing w:after="80" w:line="290" w:lineRule="auto"/>
-      </w:pPr>
-      <w:r>
         <w:t xml:space="preserve">The model/provider choice for the chatbot (self-hosted vs. external LLM API) is not yet finalized; both paths are accounted for in </w:t>
       </w:r>
       <w:proofErr w:type="gramStart"/>
@@ -703,29 +518,7 @@
           <w:sz w:val="27"/>
           <w:szCs w:val="27"/>
         </w:rPr>
-        <w:t xml:space="preserve">3. </w:t>
-      </w:r>
-      <w:proofErr w:type="gramStart"/>
-      <w:r>
-        <w:rPr>
-          <w:b/>
-          <w:bCs/>
-          <w:color w:val="1B2430"/>
-          <w:sz w:val="27"/>
-          <w:szCs w:val="27"/>
-        </w:rPr>
-        <w:t>Overall</w:t>
-      </w:r>
-      <w:proofErr w:type="gramEnd"/>
-      <w:r>
-        <w:rPr>
-          <w:b/>
-          <w:bCs/>
-          <w:color w:val="1B2430"/>
-          <w:sz w:val="27"/>
-          <w:szCs w:val="27"/>
-        </w:rPr>
-        <w:t xml:space="preserve"> AI Service Structure</w:t>
+        <w:t>3. Overall AI Service Structure</w:t>
       </w:r>
     </w:p>
     <w:p>
@@ -772,7 +565,6 @@
       <w:pPr>
         <w:spacing w:after="20"/>
       </w:pPr>
-      <w:proofErr w:type="spellStart"/>
       <w:r>
         <w:rPr>
           <w:rFonts w:ascii="Consolas" w:eastAsia="Consolas" w:hAnsi="Consolas" w:cs="Consolas"/>
@@ -780,22 +572,18 @@
           <w:sz w:val="18"/>
           <w:szCs w:val="18"/>
         </w:rPr>
-        <w:t>hisabdo</w:t>
-      </w:r>
-      <w:proofErr w:type="spellEnd"/>
-      <w:r>
+        <w:t>HisabDo-webapp-ai/</w:t>
+      </w:r>
+    </w:p>
+    <w:p>
+      <w:pPr>
+        <w:spacing w:after="20"/>
         <w:rPr>
           <w:rFonts w:ascii="Consolas" w:eastAsia="Consolas" w:hAnsi="Consolas" w:cs="Consolas"/>
           <w:color w:val="1B2430"/>
           <w:sz w:val="18"/>
           <w:szCs w:val="18"/>
         </w:rPr>
-        <w:t>-webapp-ai/</w:t>
-      </w:r>
-    </w:p>
-    <w:p>
-      <w:pPr>
-        <w:spacing w:after="20"/>
       </w:pPr>
       <w:r>
         <w:rPr>
@@ -804,7 +592,7 @@
           <w:sz w:val="18"/>
           <w:szCs w:val="18"/>
         </w:rPr>
-        <w:t>├── app/</w:t>
+        <w:t>├── data</w:t>
       </w:r>
     </w:p>
     <w:p>
@@ -818,19 +606,19 @@
           <w:sz w:val="18"/>
           <w:szCs w:val="18"/>
         </w:rPr>
-        <w:t xml:space="preserve">│   ├── main.py                # </w:t>
-      </w:r>
-      <w:proofErr w:type="spellStart"/>
-      <w:r>
+        <w:t>|</w:t>
+      </w:r>
+    </w:p>
+    <w:p>
+      <w:pPr>
+        <w:spacing w:after="20"/>
         <w:rPr>
           <w:rFonts w:ascii="Consolas" w:eastAsia="Consolas" w:hAnsi="Consolas" w:cs="Consolas"/>
           <w:color w:val="1B2430"/>
           <w:sz w:val="18"/>
           <w:szCs w:val="18"/>
         </w:rPr>
-        <w:t>FastAPI</w:t>
-      </w:r>
-      <w:proofErr w:type="spellEnd"/>
+      </w:pPr>
       <w:r>
         <w:rPr>
           <w:rFonts w:ascii="Consolas" w:eastAsia="Consolas" w:hAnsi="Consolas" w:cs="Consolas"/>
@@ -838,7 +626,7 @@
           <w:sz w:val="18"/>
           <w:szCs w:val="18"/>
         </w:rPr>
-        <w:t xml:space="preserve"> app factory, router mounting</w:t>
+        <w:t xml:space="preserve">│── research </w:t>
       </w:r>
     </w:p>
     <w:p>
@@ -852,9 +640,13 @@
           <w:sz w:val="18"/>
           <w:szCs w:val="18"/>
         </w:rPr>
-        <w:t xml:space="preserve">│   ├── </w:t>
-      </w:r>
-      <w:proofErr w:type="spellStart"/>
+        <w:t>|</w:t>
+      </w:r>
+    </w:p>
+    <w:p>
+      <w:pPr>
+        <w:spacing w:after="20"/>
+      </w:pPr>
       <w:r>
         <w:rPr>
           <w:rFonts w:ascii="Consolas" w:eastAsia="Consolas" w:hAnsi="Consolas" w:cs="Consolas"/>
@@ -862,9 +654,13 @@
           <w:sz w:val="18"/>
           <w:szCs w:val="18"/>
         </w:rPr>
-        <w:t>api</w:t>
-      </w:r>
-      <w:proofErr w:type="spellEnd"/>
+        <w:t>│── docs</w:t>
+      </w:r>
+    </w:p>
+    <w:p>
+      <w:pPr>
+        <w:spacing w:after="20"/>
+      </w:pPr>
       <w:r>
         <w:rPr>
           <w:rFonts w:ascii="Consolas" w:eastAsia="Consolas" w:hAnsi="Consolas" w:cs="Consolas"/>
@@ -872,11 +668,14 @@
           <w:sz w:val="18"/>
           <w:szCs w:val="18"/>
         </w:rPr>
-        <w:t>/</w:t>
-      </w:r>
-    </w:p>
-    <w:p>
-      <w:pPr>
+        <w:t xml:space="preserve">|  </w:t>
+      </w:r>
+    </w:p>
+    <w:p>
+      <w:pPr>
+        <w:tabs>
+          <w:tab w:val="left" w:pos="6240"/>
+        </w:tabs>
         <w:spacing w:after="20"/>
       </w:pPr>
       <w:r>
@@ -886,13 +685,8 @@
           <w:sz w:val="18"/>
           <w:szCs w:val="18"/>
         </w:rPr>
-        <w:t>│   │   └── v1/</w:t>
-      </w:r>
-    </w:p>
-    <w:p>
-      <w:pPr>
-        <w:spacing w:after="20"/>
-      </w:pPr>
+        <w:t>│── tests</w:t>
+      </w:r>
       <w:r>
         <w:rPr>
           <w:rFonts w:ascii="Consolas" w:eastAsia="Consolas" w:hAnsi="Consolas" w:cs="Consolas"/>
@@ -900,9 +694,13 @@
           <w:sz w:val="18"/>
           <w:szCs w:val="18"/>
         </w:rPr>
-        <w:t>│   │       ├── chatbot.py     # POST /</w:t>
-      </w:r>
-      <w:proofErr w:type="spellStart"/>
+        <w:tab/>
+      </w:r>
+    </w:p>
+    <w:p>
+      <w:pPr>
+        <w:spacing w:after="20"/>
+      </w:pPr>
       <w:r>
         <w:rPr>
           <w:rFonts w:ascii="Consolas" w:eastAsia="Consolas" w:hAnsi="Consolas" w:cs="Consolas"/>
@@ -910,22 +708,18 @@
           <w:sz w:val="18"/>
           <w:szCs w:val="18"/>
         </w:rPr>
-        <w:t>api</w:t>
-      </w:r>
-      <w:proofErr w:type="spellEnd"/>
-      <w:r>
+        <w:t xml:space="preserve">| </w:t>
+      </w:r>
+    </w:p>
+    <w:p>
+      <w:pPr>
+        <w:spacing w:after="20"/>
         <w:rPr>
           <w:rFonts w:ascii="Consolas" w:eastAsia="Consolas" w:hAnsi="Consolas" w:cs="Consolas"/>
           <w:color w:val="1B2430"/>
           <w:sz w:val="18"/>
           <w:szCs w:val="18"/>
         </w:rPr>
-        <w:t>/v1/chatbot</w:t>
-      </w:r>
-    </w:p>
-    <w:p>
-      <w:pPr>
-        <w:spacing w:after="20"/>
       </w:pPr>
       <w:r>
         <w:rPr>
@@ -934,9 +728,13 @@
           <w:sz w:val="18"/>
           <w:szCs w:val="18"/>
         </w:rPr>
-        <w:t xml:space="preserve">│   │       ├── </w:t>
-      </w:r>
-      <w:proofErr w:type="gramStart"/>
+        <w:t>│── src</w:t>
+      </w:r>
+    </w:p>
+    <w:p>
+      <w:pPr>
+        <w:spacing w:after="20"/>
+      </w:pPr>
       <w:r>
         <w:rPr>
           <w:rFonts w:ascii="Consolas" w:eastAsia="Consolas" w:hAnsi="Consolas" w:cs="Consolas"/>
@@ -944,9 +742,8 @@
           <w:sz w:val="18"/>
           <w:szCs w:val="18"/>
         </w:rPr>
-        <w:t>categorize.py  #</w:t>
-      </w:r>
-      <w:proofErr w:type="gramEnd"/>
+        <w:t xml:space="preserve">       |──</w:t>
+      </w:r>
       <w:r>
         <w:rPr>
           <w:rFonts w:ascii="Consolas" w:eastAsia="Consolas" w:hAnsi="Consolas" w:cs="Consolas"/>
@@ -954,9 +751,8 @@
           <w:sz w:val="18"/>
           <w:szCs w:val="18"/>
         </w:rPr>
-        <w:t xml:space="preserve"> POST /</w:t>
-      </w:r>
-      <w:proofErr w:type="spellStart"/>
+        <w:t>i</w:t>
+      </w:r>
       <w:r>
         <w:rPr>
           <w:rFonts w:ascii="Consolas" w:eastAsia="Consolas" w:hAnsi="Consolas" w:cs="Consolas"/>
@@ -964,9 +760,14 @@
           <w:sz w:val="18"/>
           <w:szCs w:val="18"/>
         </w:rPr>
-        <w:t>api</w:t>
-      </w:r>
-      <w:proofErr w:type="spellEnd"/>
+        <w:t xml:space="preserve">ntegration   </w:t>
+      </w:r>
+    </w:p>
+    <w:p>
+      <w:pPr>
+        <w:spacing w:after="20"/>
+        <w:ind w:left="720"/>
+      </w:pPr>
       <w:r>
         <w:rPr>
           <w:rFonts w:ascii="Consolas" w:eastAsia="Consolas" w:hAnsi="Consolas" w:cs="Consolas"/>
@@ -974,12 +775,13 @@
           <w:sz w:val="18"/>
           <w:szCs w:val="18"/>
         </w:rPr>
-        <w:t>/v1/categorize</w:t>
+        <w:t xml:space="preserve">│   </w:t>
       </w:r>
     </w:p>
     <w:p>
       <w:pPr>
         <w:spacing w:after="20"/>
+        <w:ind w:left="720"/>
       </w:pPr>
       <w:r>
         <w:rPr>
@@ -988,9 +790,14 @@
           <w:sz w:val="18"/>
           <w:szCs w:val="18"/>
         </w:rPr>
-        <w:t xml:space="preserve">│   │       └── health.py      # </w:t>
-      </w:r>
-      <w:proofErr w:type="gramStart"/>
+        <w:t xml:space="preserve">│   </w:t>
+      </w:r>
+    </w:p>
+    <w:p>
+      <w:pPr>
+        <w:spacing w:after="20"/>
+        <w:ind w:left="720"/>
+      </w:pPr>
       <w:r>
         <w:rPr>
           <w:rFonts w:ascii="Consolas" w:eastAsia="Consolas" w:hAnsi="Consolas" w:cs="Consolas"/>
@@ -998,10 +805,14 @@
           <w:sz w:val="18"/>
           <w:szCs w:val="18"/>
         </w:rPr>
-        <w:t>GET  /</w:t>
-      </w:r>
-      <w:proofErr w:type="spellStart"/>
-      <w:proofErr w:type="gramEnd"/>
+        <w:t xml:space="preserve">│──expense_categorization   </w:t>
+      </w:r>
+    </w:p>
+    <w:p>
+      <w:pPr>
+        <w:spacing w:after="20"/>
+        <w:ind w:left="720"/>
+      </w:pPr>
       <w:r>
         <w:rPr>
           <w:rFonts w:ascii="Consolas" w:eastAsia="Consolas" w:hAnsi="Consolas" w:cs="Consolas"/>
@@ -1009,9 +820,14 @@
           <w:sz w:val="18"/>
           <w:szCs w:val="18"/>
         </w:rPr>
-        <w:t>api</w:t>
-      </w:r>
-      <w:proofErr w:type="spellEnd"/>
+        <w:t xml:space="preserve">│      </w:t>
+      </w:r>
+    </w:p>
+    <w:p>
+      <w:pPr>
+        <w:spacing w:after="20"/>
+        <w:ind w:left="720"/>
+      </w:pPr>
       <w:r>
         <w:rPr>
           <w:rFonts w:ascii="Consolas" w:eastAsia="Consolas" w:hAnsi="Consolas" w:cs="Consolas"/>
@@ -1019,12 +835,13 @@
           <w:sz w:val="18"/>
           <w:szCs w:val="18"/>
         </w:rPr>
-        <w:t>/v1/health, /version</w:t>
+        <w:t xml:space="preserve">│   </w:t>
       </w:r>
     </w:p>
     <w:p>
       <w:pPr>
         <w:spacing w:after="20"/>
+        <w:ind w:left="720"/>
       </w:pPr>
       <w:r>
         <w:rPr>
@@ -1033,12 +850,13 @@
           <w:sz w:val="18"/>
           <w:szCs w:val="18"/>
         </w:rPr>
-        <w:t>│   ├── core/</w:t>
+        <w:t xml:space="preserve">│──financial_assistant   </w:t>
       </w:r>
     </w:p>
     <w:p>
       <w:pPr>
         <w:spacing w:after="20"/>
+        <w:ind w:left="720"/>
       </w:pPr>
       <w:r>
         <w:rPr>
@@ -1047,22 +865,24 @@
           <w:sz w:val="18"/>
           <w:szCs w:val="18"/>
         </w:rPr>
-        <w:t>│   │   ├── config.py          # settings &amp; env vars</w:t>
+        <w:t xml:space="preserve">│   </w:t>
       </w:r>
     </w:p>
     <w:p>
       <w:pPr>
         <w:spacing w:after="20"/>
-      </w:pPr>
-      <w:r>
         <w:rPr>
           <w:rFonts w:ascii="Consolas" w:eastAsia="Consolas" w:hAnsi="Consolas" w:cs="Consolas"/>
           <w:color w:val="1B2430"/>
           <w:sz w:val="18"/>
           <w:szCs w:val="18"/>
         </w:rPr>
-        <w:t>│   │   ├── security.py        # service-token / API-key verification</w:t>
-      </w:r>
+      </w:pPr>
+    </w:p>
+    <w:p>
+      <w:pPr>
+        <w:spacing w:after="20"/>
+      </w:pPr>
     </w:p>
     <w:p>
       <w:pPr>
@@ -1075,273 +895,8 @@
           <w:sz w:val="18"/>
           <w:szCs w:val="18"/>
         </w:rPr>
-        <w:t>│   │   └── logging.py</w:t>
-      </w:r>
-    </w:p>
-    <w:p>
-      <w:pPr>
-        <w:spacing w:after="20"/>
-      </w:pPr>
-      <w:r>
-        <w:rPr>
-          <w:rFonts w:ascii="Consolas" w:eastAsia="Consolas" w:hAnsi="Consolas" w:cs="Consolas"/>
-          <w:color w:val="1B2430"/>
-          <w:sz w:val="18"/>
-          <w:szCs w:val="18"/>
-        </w:rPr>
-        <w:t>│   ├── services/</w:t>
-      </w:r>
-    </w:p>
-    <w:p>
-      <w:pPr>
-        <w:spacing w:after="20"/>
-      </w:pPr>
-      <w:r>
-        <w:rPr>
-          <w:rFonts w:ascii="Consolas" w:eastAsia="Consolas" w:hAnsi="Consolas" w:cs="Consolas"/>
-          <w:color w:val="1B2430"/>
-          <w:sz w:val="18"/>
-          <w:szCs w:val="18"/>
-        </w:rPr>
-        <w:t>│   │   ├── chatbot_service.py         # prompt/context handling</w:t>
-      </w:r>
-    </w:p>
-    <w:p>
-      <w:pPr>
-        <w:spacing w:after="20"/>
-      </w:pPr>
-      <w:r>
-        <w:rPr>
-          <w:rFonts w:ascii="Consolas" w:eastAsia="Consolas" w:hAnsi="Consolas" w:cs="Consolas"/>
-          <w:color w:val="1B2430"/>
-          <w:sz w:val="18"/>
-          <w:szCs w:val="18"/>
-        </w:rPr>
-        <w:t>│   │   └── categorization_service.py</w:t>
-      </w:r>
-    </w:p>
-    <w:p>
-      <w:pPr>
-        <w:spacing w:after="20"/>
-      </w:pPr>
-      <w:r>
-        <w:rPr>
-          <w:rFonts w:ascii="Consolas" w:eastAsia="Consolas" w:hAnsi="Consolas" w:cs="Consolas"/>
-          <w:color w:val="1B2430"/>
-          <w:sz w:val="18"/>
-          <w:szCs w:val="18"/>
-        </w:rPr>
-        <w:t>│   ├── models/</w:t>
-      </w:r>
-    </w:p>
-    <w:p>
-      <w:pPr>
-        <w:spacing w:after="20"/>
-      </w:pPr>
-      <w:r>
-        <w:rPr>
-          <w:rFonts w:ascii="Consolas" w:eastAsia="Consolas" w:hAnsi="Consolas" w:cs="Consolas"/>
-          <w:color w:val="1B2430"/>
-          <w:sz w:val="18"/>
-          <w:szCs w:val="18"/>
-        </w:rPr>
-        <w:t xml:space="preserve">│   │   └── schemas.py             # </w:t>
-      </w:r>
-      <w:proofErr w:type="spellStart"/>
-      <w:r>
-        <w:rPr>
-          <w:rFonts w:ascii="Consolas" w:eastAsia="Consolas" w:hAnsi="Consolas" w:cs="Consolas"/>
-          <w:color w:val="1B2430"/>
-          <w:sz w:val="18"/>
-          <w:szCs w:val="18"/>
-        </w:rPr>
-        <w:t>Pydantic</w:t>
-      </w:r>
-      <w:proofErr w:type="spellEnd"/>
-      <w:r>
-        <w:rPr>
-          <w:rFonts w:ascii="Consolas" w:eastAsia="Consolas" w:hAnsi="Consolas" w:cs="Consolas"/>
-          <w:color w:val="1B2430"/>
-          <w:sz w:val="18"/>
-          <w:szCs w:val="18"/>
-        </w:rPr>
-        <w:t xml:space="preserve"> request/response models</w:t>
-      </w:r>
-    </w:p>
-    <w:p>
-      <w:pPr>
-        <w:spacing w:after="20"/>
-      </w:pPr>
-      <w:r>
-        <w:rPr>
-          <w:rFonts w:ascii="Consolas" w:eastAsia="Consolas" w:hAnsi="Consolas" w:cs="Consolas"/>
-          <w:color w:val="1B2430"/>
-          <w:sz w:val="18"/>
-          <w:szCs w:val="18"/>
-        </w:rPr>
-        <w:t>│   ├── ml/</w:t>
-      </w:r>
-    </w:p>
-    <w:p>
-      <w:pPr>
-        <w:spacing w:after="20"/>
-      </w:pPr>
-      <w:r>
-        <w:rPr>
-          <w:rFonts w:ascii="Consolas" w:eastAsia="Consolas" w:hAnsi="Consolas" w:cs="Consolas"/>
-          <w:color w:val="1B2430"/>
-          <w:sz w:val="18"/>
-          <w:szCs w:val="18"/>
-        </w:rPr>
-        <w:t>│   │   ├── categorizer.py         # classifier / rules engine</w:t>
-      </w:r>
-    </w:p>
-    <w:p>
-      <w:pPr>
-        <w:spacing w:after="20"/>
-      </w:pPr>
-      <w:r>
-        <w:rPr>
-          <w:rFonts w:ascii="Consolas" w:eastAsia="Consolas" w:hAnsi="Consolas" w:cs="Consolas"/>
-          <w:color w:val="1B2430"/>
-          <w:sz w:val="18"/>
-          <w:szCs w:val="18"/>
-        </w:rPr>
-        <w:t xml:space="preserve">│   │   └── </w:t>
-      </w:r>
-      <w:proofErr w:type="spellStart"/>
-      <w:r>
-        <w:rPr>
-          <w:rFonts w:ascii="Consolas" w:eastAsia="Consolas" w:hAnsi="Consolas" w:cs="Consolas"/>
-          <w:color w:val="1B2430"/>
-          <w:sz w:val="18"/>
-          <w:szCs w:val="18"/>
-        </w:rPr>
-        <w:t>model_</w:t>
-      </w:r>
-      <w:proofErr w:type="gramStart"/>
-      <w:r>
-        <w:rPr>
-          <w:rFonts w:ascii="Consolas" w:eastAsia="Consolas" w:hAnsi="Consolas" w:cs="Consolas"/>
-          <w:color w:val="1B2430"/>
-          <w:sz w:val="18"/>
-          <w:szCs w:val="18"/>
-        </w:rPr>
-        <w:t>artifacts</w:t>
-      </w:r>
-      <w:proofErr w:type="spellEnd"/>
-      <w:r>
-        <w:rPr>
-          <w:rFonts w:ascii="Consolas" w:eastAsia="Consolas" w:hAnsi="Consolas" w:cs="Consolas"/>
-          <w:color w:val="1B2430"/>
-          <w:sz w:val="18"/>
-          <w:szCs w:val="18"/>
-        </w:rPr>
-        <w:t>/       #</w:t>
-      </w:r>
-      <w:proofErr w:type="gramEnd"/>
-      <w:r>
-        <w:rPr>
-          <w:rFonts w:ascii="Consolas" w:eastAsia="Consolas" w:hAnsi="Consolas" w:cs="Consolas"/>
-          <w:color w:val="1B2430"/>
-          <w:sz w:val="18"/>
-          <w:szCs w:val="18"/>
-        </w:rPr>
-        <w:t xml:space="preserve"> trained model files (</w:t>
-      </w:r>
-      <w:proofErr w:type="spellStart"/>
-      <w:r>
-        <w:rPr>
-          <w:rFonts w:ascii="Consolas" w:eastAsia="Consolas" w:hAnsi="Consolas" w:cs="Consolas"/>
-          <w:color w:val="1B2430"/>
-          <w:sz w:val="18"/>
-          <w:szCs w:val="18"/>
-        </w:rPr>
-        <w:t>gitignored</w:t>
-      </w:r>
-      <w:proofErr w:type="spellEnd"/>
-      <w:r>
-        <w:rPr>
-          <w:rFonts w:ascii="Consolas" w:eastAsia="Consolas" w:hAnsi="Consolas" w:cs="Consolas"/>
-          <w:color w:val="1B2430"/>
-          <w:sz w:val="18"/>
-          <w:szCs w:val="18"/>
-        </w:rPr>
-        <w:t>)</w:t>
-      </w:r>
-    </w:p>
-    <w:p>
-      <w:pPr>
-        <w:spacing w:after="20"/>
-      </w:pPr>
-      <w:r>
-        <w:rPr>
-          <w:rFonts w:ascii="Consolas" w:eastAsia="Consolas" w:hAnsi="Consolas" w:cs="Consolas"/>
-          <w:color w:val="1B2430"/>
-          <w:sz w:val="18"/>
-          <w:szCs w:val="18"/>
-        </w:rPr>
-        <w:t>│   └── tests/</w:t>
-      </w:r>
-    </w:p>
-    <w:p>
-      <w:pPr>
-        <w:spacing w:after="20"/>
-      </w:pPr>
-      <w:r>
-        <w:rPr>
-          <w:rFonts w:ascii="Consolas" w:eastAsia="Consolas" w:hAnsi="Consolas" w:cs="Consolas"/>
-          <w:color w:val="1B2430"/>
-          <w:sz w:val="18"/>
-          <w:szCs w:val="18"/>
-        </w:rPr>
-        <w:lastRenderedPageBreak/>
-        <w:t>├── requirements.txt</w:t>
-      </w:r>
-    </w:p>
-    <w:p>
-      <w:pPr>
-        <w:spacing w:after="20"/>
-      </w:pPr>
-      <w:r>
-        <w:rPr>
-          <w:rFonts w:ascii="Consolas" w:eastAsia="Consolas" w:hAnsi="Consolas" w:cs="Consolas"/>
-          <w:color w:val="1B2430"/>
-          <w:sz w:val="18"/>
-          <w:szCs w:val="18"/>
-        </w:rPr>
-        <w:t xml:space="preserve">├── </w:t>
-      </w:r>
-      <w:proofErr w:type="spellStart"/>
-      <w:r>
-        <w:rPr>
-          <w:rFonts w:ascii="Consolas" w:eastAsia="Consolas" w:hAnsi="Consolas" w:cs="Consolas"/>
-          <w:color w:val="1B2430"/>
-          <w:sz w:val="18"/>
-          <w:szCs w:val="18"/>
-        </w:rPr>
-        <w:t>Dockerfile</w:t>
-      </w:r>
-      <w:proofErr w:type="spellEnd"/>
-    </w:p>
-    <w:p>
-      <w:pPr>
-        <w:spacing w:after="20"/>
-      </w:pPr>
-      <w:r>
-        <w:rPr>
-          <w:rFonts w:ascii="Consolas" w:eastAsia="Consolas" w:hAnsi="Consolas" w:cs="Consolas"/>
-          <w:color w:val="1B2430"/>
-          <w:sz w:val="18"/>
-          <w:szCs w:val="18"/>
-        </w:rPr>
-        <w:t>└── README.md</w:t>
-      </w:r>
-    </w:p>
-    <w:p>
-      <w:pPr>
-        <w:spacing w:after="160" w:line="300" w:lineRule="auto"/>
-      </w:pPr>
+        <w:t xml:space="preserve">   </w:t>
+      </w:r>
     </w:p>
     <w:p>
       <w:pPr>
@@ -1359,29 +914,7 @@
           <w:sz w:val="27"/>
           <w:szCs w:val="27"/>
         </w:rPr>
-        <w:t xml:space="preserve">4. </w:t>
-      </w:r>
-      <w:proofErr w:type="spellStart"/>
-      <w:r>
-        <w:rPr>
-          <w:b/>
-          <w:bCs/>
-          <w:color w:val="1B2430"/>
-          <w:sz w:val="27"/>
-          <w:szCs w:val="27"/>
-        </w:rPr>
-        <w:t>FastAPI</w:t>
-      </w:r>
-      <w:proofErr w:type="spellEnd"/>
-      <w:r>
-        <w:rPr>
-          <w:b/>
-          <w:bCs/>
-          <w:color w:val="1B2430"/>
-          <w:sz w:val="27"/>
-          <w:szCs w:val="27"/>
-        </w:rPr>
-        <w:t xml:space="preserve"> Service &amp; Endpoint Planning</w:t>
+        <w:t>4. FastAPI Service &amp; Endpoint Planning</w:t>
       </w:r>
     </w:p>
     <w:p>
@@ -1389,15 +922,8 @@
         <w:spacing w:after="160" w:line="300" w:lineRule="auto"/>
       </w:pPr>
       <w:r>
-        <w:t>All endpoints are versioned under /</w:t>
-      </w:r>
-      <w:proofErr w:type="spellStart"/>
-      <w:r>
-        <w:t>api</w:t>
-      </w:r>
-      <w:proofErr w:type="spellEnd"/>
-      <w:r>
-        <w:t>/v1 so the contract with the backend can evolve without breaking existing integrations.</w:t>
+        <w:lastRenderedPageBreak/>
+        <w:t>All endpoints are versioned under /api/v1 so the contract with the backend can evolve without breaking existing integrations.</w:t>
       </w:r>
     </w:p>
     <w:tbl>
@@ -1424,12 +950,6 @@
         <w:gridCol w:w="1740"/>
       </w:tblGrid>
       <w:tr>
-        <w:tblPrEx>
-          <w:tblCellMar>
-            <w:top w:w="0" w:type="dxa"/>
-            <w:bottom w:w="0" w:type="dxa"/>
-          </w:tblCellMar>
-        </w:tblPrEx>
         <w:tc>
           <w:tcPr>
             <w:tcW w:w="1500" w:type="dxa"/>
@@ -1532,12 +1052,6 @@
         </w:tc>
       </w:tr>
       <w:tr>
-        <w:tblPrEx>
-          <w:tblCellMar>
-            <w:top w:w="0" w:type="dxa"/>
-            <w:bottom w:w="0" w:type="dxa"/>
-          </w:tblCellMar>
-        </w:tblPrEx>
         <w:tc>
           <w:tcPr>
             <w:tcW w:w="1500" w:type="dxa"/>
@@ -1578,23 +1092,7 @@
                 <w:sz w:val="19"/>
                 <w:szCs w:val="19"/>
               </w:rPr>
-              <w:t>/</w:t>
-            </w:r>
-            <w:proofErr w:type="spellStart"/>
-            <w:r>
-              <w:rPr>
-                <w:sz w:val="19"/>
-                <w:szCs w:val="19"/>
-              </w:rPr>
-              <w:t>api</w:t>
-            </w:r>
-            <w:proofErr w:type="spellEnd"/>
-            <w:r>
-              <w:rPr>
-                <w:sz w:val="19"/>
-                <w:szCs w:val="19"/>
-              </w:rPr>
-              <w:t>/v1/health</w:t>
+              <w:t>/api/v1/health</w:t>
             </w:r>
           </w:p>
         </w:tc>
@@ -1642,12 +1140,6 @@
         </w:tc>
       </w:tr>
       <w:tr>
-        <w:tblPrEx>
-          <w:tblCellMar>
-            <w:top w:w="0" w:type="dxa"/>
-            <w:bottom w:w="0" w:type="dxa"/>
-          </w:tblCellMar>
-        </w:tblPrEx>
         <w:tc>
           <w:tcPr>
             <w:tcW w:w="1500" w:type="dxa"/>
@@ -1690,23 +1182,7 @@
                 <w:sz w:val="19"/>
                 <w:szCs w:val="19"/>
               </w:rPr>
-              <w:t>/</w:t>
-            </w:r>
-            <w:proofErr w:type="spellStart"/>
-            <w:r>
-              <w:rPr>
-                <w:sz w:val="19"/>
-                <w:szCs w:val="19"/>
-              </w:rPr>
-              <w:t>api</w:t>
-            </w:r>
-            <w:proofErr w:type="spellEnd"/>
-            <w:r>
-              <w:rPr>
-                <w:sz w:val="19"/>
-                <w:szCs w:val="19"/>
-              </w:rPr>
-              <w:t>/v1/version</w:t>
+              <w:t>/api/v1/version</w:t>
             </w:r>
           </w:p>
         </w:tc>
@@ -1756,12 +1232,6 @@
         </w:tc>
       </w:tr>
       <w:tr>
-        <w:tblPrEx>
-          <w:tblCellMar>
-            <w:top w:w="0" w:type="dxa"/>
-            <w:bottom w:w="0" w:type="dxa"/>
-          </w:tblCellMar>
-        </w:tblPrEx>
         <w:tc>
           <w:tcPr>
             <w:tcW w:w="1500" w:type="dxa"/>
@@ -1802,23 +1272,7 @@
                 <w:sz w:val="19"/>
                 <w:szCs w:val="19"/>
               </w:rPr>
-              <w:t>/</w:t>
-            </w:r>
-            <w:proofErr w:type="spellStart"/>
-            <w:r>
-              <w:rPr>
-                <w:sz w:val="19"/>
-                <w:szCs w:val="19"/>
-              </w:rPr>
-              <w:t>api</w:t>
-            </w:r>
-            <w:proofErr w:type="spellEnd"/>
-            <w:r>
-              <w:rPr>
-                <w:sz w:val="19"/>
-                <w:szCs w:val="19"/>
-              </w:rPr>
-              <w:t>/v1/chatbot</w:t>
+              <w:t>/api/v1/chatbot</w:t>
             </w:r>
           </w:p>
         </w:tc>
@@ -1866,12 +1320,6 @@
         </w:tc>
       </w:tr>
       <w:tr>
-        <w:tblPrEx>
-          <w:tblCellMar>
-            <w:top w:w="0" w:type="dxa"/>
-            <w:bottom w:w="0" w:type="dxa"/>
-          </w:tblCellMar>
-        </w:tblPrEx>
         <w:tc>
           <w:tcPr>
             <w:tcW w:w="1500" w:type="dxa"/>
@@ -1914,23 +1362,7 @@
                 <w:sz w:val="19"/>
                 <w:szCs w:val="19"/>
               </w:rPr>
-              <w:t>/</w:t>
-            </w:r>
-            <w:proofErr w:type="spellStart"/>
-            <w:r>
-              <w:rPr>
-                <w:sz w:val="19"/>
-                <w:szCs w:val="19"/>
-              </w:rPr>
-              <w:t>api</w:t>
-            </w:r>
-            <w:proofErr w:type="spellEnd"/>
-            <w:r>
-              <w:rPr>
-                <w:sz w:val="19"/>
-                <w:szCs w:val="19"/>
-              </w:rPr>
-              <w:t>/v1/categorize</w:t>
+              <w:t>/api/v1/categorize</w:t>
             </w:r>
           </w:p>
         </w:tc>
@@ -1980,12 +1412,6 @@
         </w:tc>
       </w:tr>
       <w:tr>
-        <w:tblPrEx>
-          <w:tblCellMar>
-            <w:top w:w="0" w:type="dxa"/>
-            <w:bottom w:w="0" w:type="dxa"/>
-          </w:tblCellMar>
-        </w:tblPrEx>
         <w:tc>
           <w:tcPr>
             <w:tcW w:w="1500" w:type="dxa"/>
@@ -2026,23 +1452,7 @@
                 <w:sz w:val="19"/>
                 <w:szCs w:val="19"/>
               </w:rPr>
-              <w:t>/</w:t>
-            </w:r>
-            <w:proofErr w:type="spellStart"/>
-            <w:r>
-              <w:rPr>
-                <w:sz w:val="19"/>
-                <w:szCs w:val="19"/>
-              </w:rPr>
-              <w:t>api</w:t>
-            </w:r>
-            <w:proofErr w:type="spellEnd"/>
-            <w:r>
-              <w:rPr>
-                <w:sz w:val="19"/>
-                <w:szCs w:val="19"/>
-              </w:rPr>
-              <w:t>/v1/categorize/batch</w:t>
+              <w:t>/api/v1/categorize/batch</w:t>
             </w:r>
           </w:p>
         </w:tc>
@@ -2137,12 +1547,6 @@
         <w:gridCol w:w="3200"/>
       </w:tblGrid>
       <w:tr>
-        <w:tblPrEx>
-          <w:tblCellMar>
-            <w:top w:w="0" w:type="dxa"/>
-            <w:bottom w:w="0" w:type="dxa"/>
-          </w:tblCellMar>
-        </w:tblPrEx>
         <w:tc>
           <w:tcPr>
             <w:tcW w:w="3140" w:type="dxa"/>
@@ -2214,40 +1618,149 @@
                 <w:sz w:val="19"/>
                 <w:szCs w:val="19"/>
               </w:rPr>
-              <w:t>AI Service (</w:t>
-            </w:r>
-            <w:proofErr w:type="spellStart"/>
+              <w:t>AI Service (FastAPI)</w:t>
+            </w:r>
+          </w:p>
+        </w:tc>
+      </w:tr>
+      <w:tr>
+        <w:tc>
+          <w:tcPr>
+            <w:tcW w:w="3140" w:type="dxa"/>
+            <w:tcMar>
+              <w:top w:w="80" w:type="dxa"/>
+              <w:left w:w="110" w:type="dxa"/>
+              <w:bottom w:w="80" w:type="dxa"/>
+              <w:right w:w="110" w:type="dxa"/>
+            </w:tcMar>
+            <w:vAlign w:val="center"/>
+          </w:tcPr>
+          <w:p>
             <w:r>
               <w:rPr>
                 <w:b/>
                 <w:bCs/>
-                <w:color w:val="FFFFFF"/>
-                <w:sz w:val="19"/>
-                <w:szCs w:val="19"/>
-              </w:rPr>
-              <w:t>FastAPI</w:t>
-            </w:r>
-            <w:proofErr w:type="spellEnd"/>
+                <w:sz w:val="19"/>
+                <w:szCs w:val="19"/>
+              </w:rPr>
+              <w:t>End-user authentication</w:t>
+            </w:r>
+          </w:p>
+        </w:tc>
+        <w:tc>
+          <w:tcPr>
+            <w:tcW w:w="3200" w:type="dxa"/>
+            <w:tcMar>
+              <w:top w:w="80" w:type="dxa"/>
+              <w:left w:w="110" w:type="dxa"/>
+              <w:bottom w:w="80" w:type="dxa"/>
+              <w:right w:w="110" w:type="dxa"/>
+            </w:tcMar>
+            <w:vAlign w:val="center"/>
+          </w:tcPr>
+          <w:p>
+            <w:r>
+              <w:rPr>
+                <w:sz w:val="19"/>
+                <w:szCs w:val="19"/>
+              </w:rPr>
+              <w:t>Owns login, sessions, JWT issuance</w:t>
+            </w:r>
+          </w:p>
+        </w:tc>
+        <w:tc>
+          <w:tcPr>
+            <w:tcW w:w="3200" w:type="dxa"/>
+            <w:tcMar>
+              <w:top w:w="80" w:type="dxa"/>
+              <w:left w:w="110" w:type="dxa"/>
+              <w:bottom w:w="80" w:type="dxa"/>
+              <w:right w:w="110" w:type="dxa"/>
+            </w:tcMar>
+            <w:vAlign w:val="center"/>
+          </w:tcPr>
+          <w:p>
+            <w:r>
+              <w:rPr>
+                <w:sz w:val="19"/>
+                <w:szCs w:val="19"/>
+              </w:rPr>
+              <w:t>Trusts only a backend-issued service token</w:t>
+            </w:r>
+          </w:p>
+        </w:tc>
+      </w:tr>
+      <w:tr>
+        <w:tc>
+          <w:tcPr>
+            <w:tcW w:w="3140" w:type="dxa"/>
+            <w:shd w:val="clear" w:color="auto" w:fill="F6F7FA"/>
+            <w:tcMar>
+              <w:top w:w="80" w:type="dxa"/>
+              <w:left w:w="110" w:type="dxa"/>
+              <w:bottom w:w="80" w:type="dxa"/>
+              <w:right w:w="110" w:type="dxa"/>
+            </w:tcMar>
+            <w:vAlign w:val="center"/>
+          </w:tcPr>
+          <w:p>
             <w:r>
               <w:rPr>
                 <w:b/>
                 <w:bCs/>
-                <w:color w:val="FFFFFF"/>
-                <w:sz w:val="19"/>
-                <w:szCs w:val="19"/>
-              </w:rPr>
-              <w:t>)</w:t>
+                <w:sz w:val="19"/>
+                <w:szCs w:val="19"/>
+              </w:rPr>
+              <w:t>User &amp; expense data storage</w:t>
+            </w:r>
+          </w:p>
+        </w:tc>
+        <w:tc>
+          <w:tcPr>
+            <w:tcW w:w="3200" w:type="dxa"/>
+            <w:shd w:val="clear" w:color="auto" w:fill="F6F7FA"/>
+            <w:tcMar>
+              <w:top w:w="80" w:type="dxa"/>
+              <w:left w:w="110" w:type="dxa"/>
+              <w:bottom w:w="80" w:type="dxa"/>
+              <w:right w:w="110" w:type="dxa"/>
+            </w:tcMar>
+            <w:vAlign w:val="center"/>
+          </w:tcPr>
+          <w:p>
+            <w:r>
+              <w:rPr>
+                <w:sz w:val="19"/>
+                <w:szCs w:val="19"/>
+              </w:rPr>
+              <w:t>Source of truth database</w:t>
+            </w:r>
+          </w:p>
+        </w:tc>
+        <w:tc>
+          <w:tcPr>
+            <w:tcW w:w="3200" w:type="dxa"/>
+            <w:shd w:val="clear" w:color="auto" w:fill="F6F7FA"/>
+            <w:tcMar>
+              <w:top w:w="80" w:type="dxa"/>
+              <w:left w:w="110" w:type="dxa"/>
+              <w:bottom w:w="80" w:type="dxa"/>
+              <w:right w:w="110" w:type="dxa"/>
+            </w:tcMar>
+            <w:vAlign w:val="center"/>
+          </w:tcPr>
+          <w:p>
+            <w:r>
+              <w:rPr>
+                <w:sz w:val="19"/>
+                <w:szCs w:val="19"/>
+              </w:rPr>
+              <w:t>No persistent storage (stateless; optional short-lived cache)</w:t>
             </w:r>
           </w:p>
         </w:tc>
       </w:tr>
       <w:tr>
-        <w:tblPrEx>
-          <w:tblCellMar>
-            <w:top w:w="0" w:type="dxa"/>
-            <w:bottom w:w="0" w:type="dxa"/>
-          </w:tblCellMar>
-        </w:tblPrEx>
         <w:tc>
           <w:tcPr>
             <w:tcW w:w="3140" w:type="dxa"/>
@@ -2267,7 +1780,7 @@
                 <w:sz w:val="19"/>
                 <w:szCs w:val="19"/>
               </w:rPr>
-              <w:t>End-user authentication</w:t>
+              <w:t>Business rules (budgets, limits, alerts)</w:t>
             </w:r>
           </w:p>
         </w:tc>
@@ -2288,7 +1801,7 @@
                 <w:sz w:val="19"/>
                 <w:szCs w:val="19"/>
               </w:rPr>
-              <w:t>Owns login, sessions, JWT issuance</w:t>
+              <w:t>Owns and enforces</w:t>
             </w:r>
           </w:p>
         </w:tc>
@@ -2309,18 +1822,12 @@
                 <w:sz w:val="19"/>
                 <w:szCs w:val="19"/>
               </w:rPr>
-              <w:t>Trusts only a backend-issued service token</w:t>
+              <w:t>Does not own or enforce business rules; can consume backend-provided context/results where needed.</w:t>
             </w:r>
           </w:p>
         </w:tc>
       </w:tr>
       <w:tr>
-        <w:tblPrEx>
-          <w:tblCellMar>
-            <w:top w:w="0" w:type="dxa"/>
-            <w:bottom w:w="0" w:type="dxa"/>
-          </w:tblCellMar>
-        </w:tblPrEx>
         <w:tc>
           <w:tcPr>
             <w:tcW w:w="3140" w:type="dxa"/>
@@ -2341,7 +1848,7 @@
                 <w:sz w:val="19"/>
                 <w:szCs w:val="19"/>
               </w:rPr>
-              <w:t>User &amp; expense data storage</w:t>
+              <w:t>Natural-language understanding / reply generation</w:t>
             </w:r>
           </w:p>
         </w:tc>
@@ -2363,7 +1870,7 @@
                 <w:sz w:val="19"/>
                 <w:szCs w:val="19"/>
               </w:rPr>
-              <w:t>Source of truth database</w:t>
+              <w:t>Not implemented here</w:t>
             </w:r>
           </w:p>
         </w:tc>
@@ -2385,18 +1892,12 @@
                 <w:sz w:val="19"/>
                 <w:szCs w:val="19"/>
               </w:rPr>
-              <w:t>No persistent storage (stateless; optional short-lived cache)</w:t>
+              <w:t>Owns entirely</w:t>
             </w:r>
           </w:p>
         </w:tc>
       </w:tr>
       <w:tr>
-        <w:tblPrEx>
-          <w:tblCellMar>
-            <w:top w:w="0" w:type="dxa"/>
-            <w:bottom w:w="0" w:type="dxa"/>
-          </w:tblCellMar>
-        </w:tblPrEx>
         <w:tc>
           <w:tcPr>
             <w:tcW w:w="3140" w:type="dxa"/>
@@ -2416,7 +1917,7 @@
                 <w:sz w:val="19"/>
                 <w:szCs w:val="19"/>
               </w:rPr>
-              <w:t>Business rules (budgets, limits, alerts)</w:t>
+              <w:t>Expense category prediction</w:t>
             </w:r>
           </w:p>
         </w:tc>
@@ -2437,7 +1938,7 @@
                 <w:sz w:val="19"/>
                 <w:szCs w:val="19"/>
               </w:rPr>
-              <w:t>Owns and enforces</w:t>
+              <w:t>Stores / applies the result</w:t>
             </w:r>
           </w:p>
         </w:tc>
@@ -2458,18 +1959,12 @@
                 <w:sz w:val="19"/>
                 <w:szCs w:val="19"/>
               </w:rPr>
-              <w:t>Not aware of business rules</w:t>
+              <w:t>Predicts, returns label + confidence</w:t>
             </w:r>
           </w:p>
         </w:tc>
       </w:tr>
       <w:tr>
-        <w:tblPrEx>
-          <w:tblCellMar>
-            <w:top w:w="0" w:type="dxa"/>
-            <w:bottom w:w="0" w:type="dxa"/>
-          </w:tblCellMar>
-        </w:tblPrEx>
         <w:tc>
           <w:tcPr>
             <w:tcW w:w="3140" w:type="dxa"/>
@@ -2490,9 +1985,68 @@
                 <w:sz w:val="19"/>
                 <w:szCs w:val="19"/>
               </w:rPr>
-              <w:t xml:space="preserve">Natural-language understanding / </w:t>
-            </w:r>
-            <w:proofErr w:type="gramStart"/>
+              <w:t>Offline model training / retraining</w:t>
+            </w:r>
+          </w:p>
+        </w:tc>
+        <w:tc>
+          <w:tcPr>
+            <w:tcW w:w="3200" w:type="dxa"/>
+            <w:shd w:val="clear" w:color="auto" w:fill="F6F7FA"/>
+            <w:tcMar>
+              <w:top w:w="80" w:type="dxa"/>
+              <w:left w:w="110" w:type="dxa"/>
+              <w:bottom w:w="80" w:type="dxa"/>
+              <w:right w:w="110" w:type="dxa"/>
+            </w:tcMar>
+            <w:vAlign w:val="center"/>
+          </w:tcPr>
+          <w:p>
+            <w:r>
+              <w:rPr>
+                <w:sz w:val="19"/>
+                <w:szCs w:val="19"/>
+              </w:rPr>
+              <w:t>Not applicable</w:t>
+            </w:r>
+          </w:p>
+        </w:tc>
+        <w:tc>
+          <w:tcPr>
+            <w:tcW w:w="3200" w:type="dxa"/>
+            <w:shd w:val="clear" w:color="auto" w:fill="F6F7FA"/>
+            <w:tcMar>
+              <w:top w:w="80" w:type="dxa"/>
+              <w:left w:w="110" w:type="dxa"/>
+              <w:bottom w:w="80" w:type="dxa"/>
+              <w:right w:w="110" w:type="dxa"/>
+            </w:tcMar>
+            <w:vAlign w:val="center"/>
+          </w:tcPr>
+          <w:p>
+            <w:r>
+              <w:rPr>
+                <w:sz w:val="19"/>
+                <w:szCs w:val="19"/>
+              </w:rPr>
+              <w:t>Owned by the AI/ML component as a separate offline process, run outside the request/response cycle (data prep, training, evaluation).</w:t>
+            </w:r>
+          </w:p>
+        </w:tc>
+      </w:tr>
+      <w:tr>
+        <w:tc>
+          <w:tcPr>
+            <w:tcW w:w="3140" w:type="dxa"/>
+            <w:tcMar>
+              <w:top w:w="80" w:type="dxa"/>
+              <w:left w:w="110" w:type="dxa"/>
+              <w:bottom w:w="80" w:type="dxa"/>
+              <w:right w:w="110" w:type="dxa"/>
+            </w:tcMar>
+            <w:vAlign w:val="center"/>
+          </w:tcPr>
+          <w:p>
             <w:r>
               <w:rPr>
                 <w:b/>
@@ -2500,9 +2054,66 @@
                 <w:sz w:val="19"/>
                 <w:szCs w:val="19"/>
               </w:rPr>
-              <w:t>reply</w:t>
-            </w:r>
-            <w:proofErr w:type="gramEnd"/>
+              <w:t>FastAPI inference / service runtime</w:t>
+            </w:r>
+          </w:p>
+        </w:tc>
+        <w:tc>
+          <w:tcPr>
+            <w:tcW w:w="3200" w:type="dxa"/>
+            <w:tcMar>
+              <w:top w:w="80" w:type="dxa"/>
+              <w:left w:w="110" w:type="dxa"/>
+              <w:bottom w:w="80" w:type="dxa"/>
+              <w:right w:w="110" w:type="dxa"/>
+            </w:tcMar>
+            <w:vAlign w:val="center"/>
+          </w:tcPr>
+          <w:p>
+            <w:r>
+              <w:rPr>
+                <w:sz w:val="19"/>
+                <w:szCs w:val="19"/>
+              </w:rPr>
+              <w:t>Not applicable</w:t>
+            </w:r>
+          </w:p>
+        </w:tc>
+        <w:tc>
+          <w:tcPr>
+            <w:tcW w:w="3200" w:type="dxa"/>
+            <w:tcMar>
+              <w:top w:w="80" w:type="dxa"/>
+              <w:left w:w="110" w:type="dxa"/>
+              <w:bottom w:w="80" w:type="dxa"/>
+              <w:right w:w="110" w:type="dxa"/>
+            </w:tcMar>
+            <w:vAlign w:val="center"/>
+          </w:tcPr>
+          <w:p>
+            <w:r>
+              <w:rPr>
+                <w:sz w:val="19"/>
+                <w:szCs w:val="19"/>
+              </w:rPr>
+              <w:t>Serves predictions from already-trained model artifacts; does not perform training within the request path.</w:t>
+            </w:r>
+          </w:p>
+        </w:tc>
+      </w:tr>
+      <w:tr>
+        <w:tc>
+          <w:tcPr>
+            <w:tcW w:w="3140" w:type="dxa"/>
+            <w:tcMar>
+              <w:top w:w="80" w:type="dxa"/>
+              <w:left w:w="110" w:type="dxa"/>
+              <w:bottom w:w="80" w:type="dxa"/>
+              <w:right w:w="110" w:type="dxa"/>
+            </w:tcMar>
+            <w:vAlign w:val="center"/>
+          </w:tcPr>
+          <w:p>
             <w:r>
               <w:rPr>
                 <w:b/>
@@ -2510,284 +2121,54 @@
                 <w:sz w:val="19"/>
                 <w:szCs w:val="19"/>
               </w:rPr>
-              <w:t xml:space="preserve"> generation</w:t>
+              <w:t>Rate limiting to end users</w:t>
             </w:r>
           </w:p>
         </w:tc>
         <w:tc>
           <w:tcPr>
             <w:tcW w:w="3200" w:type="dxa"/>
-            <w:shd w:val="clear" w:color="auto" w:fill="F6F7FA"/>
-            <w:tcMar>
-              <w:top w:w="80" w:type="dxa"/>
-              <w:left w:w="110" w:type="dxa"/>
-              <w:bottom w:w="80" w:type="dxa"/>
-              <w:right w:w="110" w:type="dxa"/>
-            </w:tcMar>
-            <w:vAlign w:val="center"/>
-          </w:tcPr>
-          <w:p>
-            <w:r>
-              <w:rPr>
-                <w:sz w:val="19"/>
-                <w:szCs w:val="19"/>
-              </w:rPr>
-              <w:t>Not implemented here</w:t>
+            <w:tcMar>
+              <w:top w:w="80" w:type="dxa"/>
+              <w:left w:w="110" w:type="dxa"/>
+              <w:bottom w:w="80" w:type="dxa"/>
+              <w:right w:w="110" w:type="dxa"/>
+            </w:tcMar>
+            <w:vAlign w:val="center"/>
+          </w:tcPr>
+          <w:p>
+            <w:r>
+              <w:rPr>
+                <w:sz w:val="19"/>
+                <w:szCs w:val="19"/>
+              </w:rPr>
+              <w:t>Owns</w:t>
             </w:r>
           </w:p>
         </w:tc>
         <w:tc>
           <w:tcPr>
             <w:tcW w:w="3200" w:type="dxa"/>
-            <w:shd w:val="clear" w:color="auto" w:fill="F6F7FA"/>
-            <w:tcMar>
-              <w:top w:w="80" w:type="dxa"/>
-              <w:left w:w="110" w:type="dxa"/>
-              <w:bottom w:w="80" w:type="dxa"/>
-              <w:right w:w="110" w:type="dxa"/>
-            </w:tcMar>
-            <w:vAlign w:val="center"/>
-          </w:tcPr>
-          <w:p>
-            <w:r>
-              <w:rPr>
-                <w:sz w:val="19"/>
-                <w:szCs w:val="19"/>
-              </w:rPr>
-              <w:t>Owns entirely</w:t>
+            <w:tcMar>
+              <w:top w:w="80" w:type="dxa"/>
+              <w:left w:w="110" w:type="dxa"/>
+              <w:bottom w:w="80" w:type="dxa"/>
+              <w:right w:w="110" w:type="dxa"/>
+            </w:tcMar>
+            <w:vAlign w:val="center"/>
+          </w:tcPr>
+          <w:p>
+            <w:r>
+              <w:rPr>
+                <w:sz w:val="19"/>
+                <w:szCs w:val="19"/>
+              </w:rPr>
+              <w:t>Internal safeguard only</w:t>
             </w:r>
           </w:p>
         </w:tc>
       </w:tr>
       <w:tr>
-        <w:tblPrEx>
-          <w:tblCellMar>
-            <w:top w:w="0" w:type="dxa"/>
-            <w:bottom w:w="0" w:type="dxa"/>
-          </w:tblCellMar>
-        </w:tblPrEx>
-        <w:tc>
-          <w:tcPr>
-            <w:tcW w:w="3140" w:type="dxa"/>
-            <w:tcMar>
-              <w:top w:w="80" w:type="dxa"/>
-              <w:left w:w="110" w:type="dxa"/>
-              <w:bottom w:w="80" w:type="dxa"/>
-              <w:right w:w="110" w:type="dxa"/>
-            </w:tcMar>
-            <w:vAlign w:val="center"/>
-          </w:tcPr>
-          <w:p>
-            <w:r>
-              <w:rPr>
-                <w:b/>
-                <w:bCs/>
-                <w:sz w:val="19"/>
-                <w:szCs w:val="19"/>
-              </w:rPr>
-              <w:t>Expense category prediction</w:t>
-            </w:r>
-          </w:p>
-        </w:tc>
-        <w:tc>
-          <w:tcPr>
-            <w:tcW w:w="3200" w:type="dxa"/>
-            <w:tcMar>
-              <w:top w:w="80" w:type="dxa"/>
-              <w:left w:w="110" w:type="dxa"/>
-              <w:bottom w:w="80" w:type="dxa"/>
-              <w:right w:w="110" w:type="dxa"/>
-            </w:tcMar>
-            <w:vAlign w:val="center"/>
-          </w:tcPr>
-          <w:p>
-            <w:r>
-              <w:rPr>
-                <w:sz w:val="19"/>
-                <w:szCs w:val="19"/>
-              </w:rPr>
-              <w:t>Stores / applies the result</w:t>
-            </w:r>
-          </w:p>
-        </w:tc>
-        <w:tc>
-          <w:tcPr>
-            <w:tcW w:w="3200" w:type="dxa"/>
-            <w:tcMar>
-              <w:top w:w="80" w:type="dxa"/>
-              <w:left w:w="110" w:type="dxa"/>
-              <w:bottom w:w="80" w:type="dxa"/>
-              <w:right w:w="110" w:type="dxa"/>
-            </w:tcMar>
-            <w:vAlign w:val="center"/>
-          </w:tcPr>
-          <w:p>
-            <w:r>
-              <w:rPr>
-                <w:sz w:val="19"/>
-                <w:szCs w:val="19"/>
-              </w:rPr>
-              <w:t>Predicts, returns label + confidence</w:t>
-            </w:r>
-          </w:p>
-        </w:tc>
-      </w:tr>
-      <w:tr>
-        <w:tblPrEx>
-          <w:tblCellMar>
-            <w:top w:w="0" w:type="dxa"/>
-            <w:bottom w:w="0" w:type="dxa"/>
-          </w:tblCellMar>
-        </w:tblPrEx>
-        <w:tc>
-          <w:tcPr>
-            <w:tcW w:w="3140" w:type="dxa"/>
-            <w:shd w:val="clear" w:color="auto" w:fill="F6F7FA"/>
-            <w:tcMar>
-              <w:top w:w="80" w:type="dxa"/>
-              <w:left w:w="110" w:type="dxa"/>
-              <w:bottom w:w="80" w:type="dxa"/>
-              <w:right w:w="110" w:type="dxa"/>
-            </w:tcMar>
-            <w:vAlign w:val="center"/>
-          </w:tcPr>
-          <w:p>
-            <w:r>
-              <w:rPr>
-                <w:b/>
-                <w:bCs/>
-                <w:sz w:val="19"/>
-                <w:szCs w:val="19"/>
-              </w:rPr>
-              <w:t>Model training / retraining</w:t>
-            </w:r>
-          </w:p>
-        </w:tc>
-        <w:tc>
-          <w:tcPr>
-            <w:tcW w:w="3200" w:type="dxa"/>
-            <w:shd w:val="clear" w:color="auto" w:fill="F6F7FA"/>
-            <w:tcMar>
-              <w:top w:w="80" w:type="dxa"/>
-              <w:left w:w="110" w:type="dxa"/>
-              <w:bottom w:w="80" w:type="dxa"/>
-              <w:right w:w="110" w:type="dxa"/>
-            </w:tcMar>
-            <w:vAlign w:val="center"/>
-          </w:tcPr>
-          <w:p>
-            <w:r>
-              <w:rPr>
-                <w:sz w:val="19"/>
-                <w:szCs w:val="19"/>
-              </w:rPr>
-              <w:t>Not applicable</w:t>
-            </w:r>
-          </w:p>
-        </w:tc>
-        <w:tc>
-          <w:tcPr>
-            <w:tcW w:w="3200" w:type="dxa"/>
-            <w:shd w:val="clear" w:color="auto" w:fill="F6F7FA"/>
-            <w:tcMar>
-              <w:top w:w="80" w:type="dxa"/>
-              <w:left w:w="110" w:type="dxa"/>
-              <w:bottom w:w="80" w:type="dxa"/>
-              <w:right w:w="110" w:type="dxa"/>
-            </w:tcMar>
-            <w:vAlign w:val="center"/>
-          </w:tcPr>
-          <w:p>
-            <w:r>
-              <w:rPr>
-                <w:sz w:val="19"/>
-                <w:szCs w:val="19"/>
-              </w:rPr>
-              <w:t>Owns entirely</w:t>
-            </w:r>
-          </w:p>
-        </w:tc>
-      </w:tr>
-      <w:tr>
-        <w:tblPrEx>
-          <w:tblCellMar>
-            <w:top w:w="0" w:type="dxa"/>
-            <w:bottom w:w="0" w:type="dxa"/>
-          </w:tblCellMar>
-        </w:tblPrEx>
-        <w:tc>
-          <w:tcPr>
-            <w:tcW w:w="3140" w:type="dxa"/>
-            <w:tcMar>
-              <w:top w:w="80" w:type="dxa"/>
-              <w:left w:w="110" w:type="dxa"/>
-              <w:bottom w:w="80" w:type="dxa"/>
-              <w:right w:w="110" w:type="dxa"/>
-            </w:tcMar>
-            <w:vAlign w:val="center"/>
-          </w:tcPr>
-          <w:p>
-            <w:r>
-              <w:rPr>
-                <w:b/>
-                <w:bCs/>
-                <w:sz w:val="19"/>
-                <w:szCs w:val="19"/>
-              </w:rPr>
-              <w:t>Rate limiting to end users</w:t>
-            </w:r>
-          </w:p>
-        </w:tc>
-        <w:tc>
-          <w:tcPr>
-            <w:tcW w:w="3200" w:type="dxa"/>
-            <w:tcMar>
-              <w:top w:w="80" w:type="dxa"/>
-              <w:left w:w="110" w:type="dxa"/>
-              <w:bottom w:w="80" w:type="dxa"/>
-              <w:right w:w="110" w:type="dxa"/>
-            </w:tcMar>
-            <w:vAlign w:val="center"/>
-          </w:tcPr>
-          <w:p>
-            <w:r>
-              <w:rPr>
-                <w:sz w:val="19"/>
-                <w:szCs w:val="19"/>
-              </w:rPr>
-              <w:t>Owns</w:t>
-            </w:r>
-          </w:p>
-        </w:tc>
-        <w:tc>
-          <w:tcPr>
-            <w:tcW w:w="3200" w:type="dxa"/>
-            <w:tcMar>
-              <w:top w:w="80" w:type="dxa"/>
-              <w:left w:w="110" w:type="dxa"/>
-              <w:bottom w:w="80" w:type="dxa"/>
-              <w:right w:w="110" w:type="dxa"/>
-            </w:tcMar>
-            <w:vAlign w:val="center"/>
-          </w:tcPr>
-          <w:p>
-            <w:r>
-              <w:rPr>
-                <w:sz w:val="19"/>
-                <w:szCs w:val="19"/>
-              </w:rPr>
-              <w:t>Internal safeguard only</w:t>
-            </w:r>
-          </w:p>
-        </w:tc>
-      </w:tr>
-      <w:tr>
-        <w:tblPrEx>
-          <w:tblCellMar>
-            <w:top w:w="0" w:type="dxa"/>
-            <w:bottom w:w="0" w:type="dxa"/>
-          </w:tblCellMar>
-        </w:tblPrEx>
         <w:tc>
           <w:tcPr>
             <w:tcW w:w="3140" w:type="dxa"/>
@@ -2912,199 +2293,112 @@
         </w:rPr>
         <w:t xml:space="preserve">Input: </w:t>
       </w:r>
-      <w:proofErr w:type="gramStart"/>
       <w:r>
         <w:rPr>
           <w:sz w:val="20"/>
           <w:szCs w:val="20"/>
         </w:rPr>
-        <w:t xml:space="preserve">{ </w:t>
-      </w:r>
-      <w:proofErr w:type="spellStart"/>
-      <w:r>
-        <w:rPr>
+        <w:t>{ user_id, message, conversation_id, history[] }</w:t>
+      </w:r>
+    </w:p>
+    <w:p>
+      <w:pPr>
+        <w:spacing w:after="80"/>
+      </w:pPr>
+      <w:r>
+        <w:rPr>
+          <w:b/>
+          <w:bCs/>
+          <w:color w:val="1B2430"/>
           <w:sz w:val="20"/>
           <w:szCs w:val="20"/>
         </w:rPr>
-        <w:t>user</w:t>
-      </w:r>
-      <w:proofErr w:type="gramEnd"/>
+        <w:lastRenderedPageBreak/>
+        <w:t xml:space="preserve">Processing: </w:t>
+      </w:r>
       <w:r>
         <w:rPr>
           <w:sz w:val="20"/>
           <w:szCs w:val="20"/>
         </w:rPr>
-        <w:t>_id</w:t>
-      </w:r>
-      <w:proofErr w:type="spellEnd"/>
-      <w:r>
-        <w:rPr>
+        <w:t>FastAPI validates the payload with Pydantic → chatbot_service builds the prompt/context → calls the configured LLM (internal or external provider) → post-processes the reply.</w:t>
+      </w:r>
+    </w:p>
+    <w:p>
+      <w:pPr>
+        <w:spacing w:after="200"/>
+      </w:pPr>
+      <w:r>
+        <w:rPr>
+          <w:b/>
+          <w:bCs/>
+          <w:color w:val="1B2430"/>
           <w:sz w:val="20"/>
           <w:szCs w:val="20"/>
         </w:rPr>
-        <w:t xml:space="preserve">, message, </w:t>
-      </w:r>
-      <w:proofErr w:type="spellStart"/>
+        <w:t xml:space="preserve">Output: </w:t>
+      </w:r>
       <w:r>
         <w:rPr>
           <w:sz w:val="20"/>
           <w:szCs w:val="20"/>
         </w:rPr>
-        <w:t>conversation_id</w:t>
-      </w:r>
-      <w:proofErr w:type="spellEnd"/>
-      <w:r>
-        <w:rPr>
+        <w:t>{ reply, conversation_id, intent (optional), tokens_used (optional) }</w:t>
+      </w:r>
+    </w:p>
+    <w:p>
+      <w:pPr>
+        <w:spacing w:before="120" w:after="80"/>
+      </w:pPr>
+      <w:r>
+        <w:rPr>
+          <w:b/>
+          <w:bCs/>
+          <w:color w:val="1B2430"/>
           <w:sz w:val="20"/>
           <w:szCs w:val="20"/>
         </w:rPr>
-        <w:t xml:space="preserve">, </w:t>
-      </w:r>
-      <w:proofErr w:type="gramStart"/>
-      <w:r>
-        <w:rPr>
-          <w:sz w:val="20"/>
-          <w:szCs w:val="20"/>
-        </w:rPr>
-        <w:t>history[] }</w:t>
-      </w:r>
-      <w:proofErr w:type="gramEnd"/>
-    </w:p>
-    <w:p>
-      <w:pPr>
-        <w:spacing w:after="80"/>
-      </w:pPr>
-      <w:r>
-        <w:rPr>
-          <w:b/>
-          <w:bCs/>
-          <w:color w:val="1B2430"/>
-          <w:sz w:val="20"/>
-          <w:szCs w:val="20"/>
-        </w:rPr>
-        <w:lastRenderedPageBreak/>
-        <w:t xml:space="preserve">Processing: </w:t>
-      </w:r>
-      <w:proofErr w:type="spellStart"/>
-      <w:r>
-        <w:rPr>
-          <w:sz w:val="20"/>
-          <w:szCs w:val="20"/>
-        </w:rPr>
-        <w:t>FastAPI</w:t>
-      </w:r>
-      <w:proofErr w:type="spellEnd"/>
-      <w:r>
-        <w:rPr>
-          <w:sz w:val="20"/>
-          <w:szCs w:val="20"/>
-        </w:rPr>
-        <w:t xml:space="preserve"> validates the payload with </w:t>
-      </w:r>
-      <w:proofErr w:type="spellStart"/>
-      <w:r>
-        <w:rPr>
-          <w:sz w:val="20"/>
-          <w:szCs w:val="20"/>
-        </w:rPr>
-        <w:t>Pydantic</w:t>
-      </w:r>
-      <w:proofErr w:type="spellEnd"/>
-      <w:r>
-        <w:rPr>
-          <w:sz w:val="20"/>
-          <w:szCs w:val="20"/>
-        </w:rPr>
-        <w:t xml:space="preserve"> → </w:t>
-      </w:r>
-      <w:proofErr w:type="spellStart"/>
-      <w:r>
-        <w:rPr>
-          <w:sz w:val="20"/>
-          <w:szCs w:val="20"/>
-        </w:rPr>
-        <w:t>chatbot_service</w:t>
-      </w:r>
-      <w:proofErr w:type="spellEnd"/>
-      <w:r>
-        <w:rPr>
-          <w:sz w:val="20"/>
-          <w:szCs w:val="20"/>
-        </w:rPr>
-        <w:t xml:space="preserve"> builds the prompt/context → calls the configured LLM (internal or external provider) → post-processes the reply.</w:t>
-      </w:r>
-    </w:p>
-    <w:p>
-      <w:pPr>
-        <w:spacing w:after="200"/>
-      </w:pPr>
-      <w:r>
-        <w:rPr>
-          <w:b/>
-          <w:bCs/>
-          <w:color w:val="1B2430"/>
-          <w:sz w:val="20"/>
-          <w:szCs w:val="20"/>
-        </w:rPr>
-        <w:t xml:space="preserve">Output: </w:t>
-      </w:r>
-      <w:proofErr w:type="gramStart"/>
-      <w:r>
-        <w:rPr>
-          <w:sz w:val="20"/>
-          <w:szCs w:val="20"/>
-        </w:rPr>
-        <w:t>{ reply</w:t>
-      </w:r>
-      <w:proofErr w:type="gramEnd"/>
-      <w:r>
-        <w:rPr>
-          <w:sz w:val="20"/>
-          <w:szCs w:val="20"/>
-        </w:rPr>
-        <w:t xml:space="preserve">, </w:t>
-      </w:r>
-      <w:proofErr w:type="spellStart"/>
-      <w:r>
-        <w:rPr>
-          <w:sz w:val="20"/>
-          <w:szCs w:val="20"/>
-        </w:rPr>
-        <w:t>conversation_id</w:t>
-      </w:r>
-      <w:proofErr w:type="spellEnd"/>
-      <w:r>
-        <w:rPr>
-          <w:sz w:val="20"/>
-          <w:szCs w:val="20"/>
-        </w:rPr>
-        <w:t xml:space="preserve">, intent (optional), </w:t>
-      </w:r>
-      <w:proofErr w:type="spellStart"/>
-      <w:r>
-        <w:rPr>
-          <w:sz w:val="20"/>
-          <w:szCs w:val="20"/>
-        </w:rPr>
-        <w:t>tokens_used</w:t>
-      </w:r>
-      <w:proofErr w:type="spellEnd"/>
-      <w:r>
-        <w:rPr>
-          <w:sz w:val="20"/>
-          <w:szCs w:val="20"/>
-        </w:rPr>
-        <w:t xml:space="preserve"> (optional</w:t>
-      </w:r>
-      <w:proofErr w:type="gramStart"/>
-      <w:r>
-        <w:rPr>
-          <w:sz w:val="20"/>
-          <w:szCs w:val="20"/>
-        </w:rPr>
-        <w:t>) }</w:t>
-      </w:r>
-      <w:proofErr w:type="gramEnd"/>
+        <w:t>Data boundary (RAG vs. authoritative data):</w:t>
+      </w:r>
+    </w:p>
+    <w:p>
+      <w:pPr>
+        <w:pStyle w:val="ListParagraph"/>
+        <w:numPr>
+          <w:ilvl w:val="0"/>
+          <w:numId w:val="2"/>
+        </w:numPr>
+        <w:spacing w:after="80" w:line="290" w:lineRule="auto"/>
+      </w:pPr>
+      <w:r>
+        <w:t>The RAG / knowledge-base (vector search) layer is scoped to HisabDo product docs, FAQs, and general financial knowledge/education content — it is not a source for live user data.</w:t>
+      </w:r>
+    </w:p>
+    <w:p>
+      <w:pPr>
+        <w:pStyle w:val="ListParagraph"/>
+        <w:numPr>
+          <w:ilvl w:val="0"/>
+          <w:numId w:val="2"/>
+        </w:numPr>
+        <w:spacing w:after="80" w:line="290" w:lineRule="auto"/>
+      </w:pPr>
+      <w:r>
+        <w:t>Exact user financial values (balance, expenses, revenue, customer outstanding, etc.) must always come from authenticated backend/API data and deterministic calculation — never from RAG retrieval.</w:t>
+      </w:r>
+    </w:p>
+    <w:p>
+      <w:pPr>
+        <w:pStyle w:val="ListParagraph"/>
+        <w:numPr>
+          <w:ilvl w:val="0"/>
+          <w:numId w:val="2"/>
+        </w:numPr>
+        <w:spacing w:after="200" w:line="290" w:lineRule="auto"/>
+      </w:pPr>
+      <w:r>
+        <w:t>RAG / vector search is not treated as the source of truth for live financial numbers; when a user asks about their own figures, the chatbot service calls the backend’s financial data API instead of retrieving from the knowledge base.</w:t>
+      </w:r>
     </w:p>
     <w:p>
       <w:pPr>
@@ -3136,166 +2430,57 @@
         </w:rPr>
         <w:t xml:space="preserve">Input: </w:t>
       </w:r>
-      <w:proofErr w:type="gramStart"/>
       <w:r>
         <w:rPr>
           <w:sz w:val="20"/>
           <w:szCs w:val="20"/>
         </w:rPr>
-        <w:t xml:space="preserve">{ </w:t>
-      </w:r>
-      <w:proofErr w:type="spellStart"/>
-      <w:r>
-        <w:rPr>
+        <w:t>{ expense_id (optional), description, amount, merchant (optional), currency }</w:t>
+      </w:r>
+    </w:p>
+    <w:p>
+      <w:pPr>
+        <w:spacing w:after="80"/>
+      </w:pPr>
+      <w:r>
+        <w:rPr>
+          <w:b/>
+          <w:bCs/>
+          <w:color w:val="1B2430"/>
           <w:sz w:val="20"/>
           <w:szCs w:val="20"/>
         </w:rPr>
-        <w:t>expense</w:t>
-      </w:r>
-      <w:proofErr w:type="gramEnd"/>
+        <w:t xml:space="preserve">Processing: </w:t>
+      </w:r>
       <w:r>
         <w:rPr>
           <w:sz w:val="20"/>
           <w:szCs w:val="20"/>
         </w:rPr>
-        <w:t>_id</w:t>
-      </w:r>
-      <w:proofErr w:type="spellEnd"/>
-      <w:r>
-        <w:rPr>
+        <w:t>FastAPI validates the payload → categorization_service normalizes the text → classifier (rule-based fallback + ML/LLM model) predicts a category → low-confidence predictions are flagged for user confirmation instead of being auto-applied.</w:t>
+      </w:r>
+    </w:p>
+    <w:p>
+      <w:pPr>
+        <w:spacing w:after="200"/>
+      </w:pPr>
+      <w:r>
+        <w:rPr>
+          <w:b/>
+          <w:bCs/>
+          <w:color w:val="1B2430"/>
           <w:sz w:val="20"/>
           <w:szCs w:val="20"/>
         </w:rPr>
-        <w:t xml:space="preserve"> (optional), description, amount, merchant (optional), </w:t>
-      </w:r>
-      <w:proofErr w:type="gramStart"/>
+        <w:t xml:space="preserve">Output: </w:t>
+      </w:r>
       <w:r>
         <w:rPr>
           <w:sz w:val="20"/>
           <w:szCs w:val="20"/>
         </w:rPr>
-        <w:t>currency }</w:t>
-      </w:r>
-      <w:proofErr w:type="gramEnd"/>
-    </w:p>
-    <w:p>
-      <w:pPr>
-        <w:spacing w:after="80"/>
-      </w:pPr>
-      <w:r>
-        <w:rPr>
-          <w:b/>
-          <w:bCs/>
-          <w:color w:val="1B2430"/>
-          <w:sz w:val="20"/>
-          <w:szCs w:val="20"/>
-        </w:rPr>
-        <w:t xml:space="preserve">Processing: </w:t>
-      </w:r>
-      <w:proofErr w:type="spellStart"/>
-      <w:r>
-        <w:rPr>
-          <w:sz w:val="20"/>
-          <w:szCs w:val="20"/>
-        </w:rPr>
-        <w:t>FastAPI</w:t>
-      </w:r>
-      <w:proofErr w:type="spellEnd"/>
-      <w:r>
-        <w:rPr>
-          <w:sz w:val="20"/>
-          <w:szCs w:val="20"/>
-        </w:rPr>
-        <w:t xml:space="preserve"> validates the payload → </w:t>
-      </w:r>
-      <w:proofErr w:type="spellStart"/>
-      <w:r>
-        <w:rPr>
-          <w:sz w:val="20"/>
-          <w:szCs w:val="20"/>
-        </w:rPr>
-        <w:t>categorization_service</w:t>
-      </w:r>
-      <w:proofErr w:type="spellEnd"/>
-      <w:r>
-        <w:rPr>
-          <w:sz w:val="20"/>
-          <w:szCs w:val="20"/>
-        </w:rPr>
-        <w:t xml:space="preserve"> normalizes the text → classifier (rule-based fallback + ML/LLM model) predicts a category → low-confidence predictions are flagged for user confirmation instead of being auto-applied.</w:t>
-      </w:r>
-    </w:p>
-    <w:p>
-      <w:pPr>
-        <w:spacing w:after="200"/>
-      </w:pPr>
-      <w:r>
-        <w:rPr>
-          <w:b/>
-          <w:bCs/>
-          <w:color w:val="1B2430"/>
-          <w:sz w:val="20"/>
-          <w:szCs w:val="20"/>
-        </w:rPr>
-        <w:t xml:space="preserve">Output: </w:t>
-      </w:r>
-      <w:proofErr w:type="gramStart"/>
-      <w:r>
-        <w:rPr>
-          <w:sz w:val="20"/>
-          <w:szCs w:val="20"/>
-        </w:rPr>
-        <w:t>{ category</w:t>
-      </w:r>
-      <w:proofErr w:type="gramEnd"/>
-      <w:r>
-        <w:rPr>
-          <w:sz w:val="20"/>
-          <w:szCs w:val="20"/>
-        </w:rPr>
-        <w:t xml:space="preserve">, confidence, </w:t>
-      </w:r>
-      <w:proofErr w:type="spellStart"/>
-      <w:r>
-        <w:rPr>
-          <w:sz w:val="20"/>
-          <w:szCs w:val="20"/>
-        </w:rPr>
-        <w:t>alternative_</w:t>
-      </w:r>
-      <w:proofErr w:type="gramStart"/>
-      <w:r>
-        <w:rPr>
-          <w:sz w:val="20"/>
-          <w:szCs w:val="20"/>
-        </w:rPr>
-        <w:t>categories</w:t>
-      </w:r>
-      <w:proofErr w:type="spellEnd"/>
-      <w:r>
-        <w:rPr>
-          <w:sz w:val="20"/>
-          <w:szCs w:val="20"/>
-        </w:rPr>
-        <w:t>[</w:t>
-      </w:r>
-      <w:proofErr w:type="gramEnd"/>
-      <w:r>
-        <w:rPr>
-          <w:sz w:val="20"/>
-          <w:szCs w:val="20"/>
-        </w:rPr>
-        <w:t>] (optional</w:t>
-      </w:r>
-      <w:proofErr w:type="gramStart"/>
-      <w:r>
-        <w:rPr>
-          <w:sz w:val="20"/>
-          <w:szCs w:val="20"/>
-        </w:rPr>
-        <w:t>) }</w:t>
-      </w:r>
-      <w:proofErr w:type="gramEnd"/>
+        <w:t>{ category, confidence, alternative_categories[] (optional) }</w:t>
+      </w:r>
     </w:p>
     <w:p>
       <w:pPr>
@@ -3402,15 +2587,8 @@
         <w:spacing w:after="80" w:line="290" w:lineRule="auto"/>
       </w:pPr>
       <w:r>
-        <w:t xml:space="preserve">Common request/response contract defined via </w:t>
-      </w:r>
-      <w:proofErr w:type="spellStart"/>
-      <w:r>
-        <w:t>Pydantic</w:t>
-      </w:r>
-      <w:proofErr w:type="spellEnd"/>
-      <w:r>
-        <w:t xml:space="preserve"> schemas on the AI side, mirrored by matching types/interfaces in the backend's API client.</w:t>
+        <w:lastRenderedPageBreak/>
+        <w:t>Common request/response contract defined via Pydantic schemas on the AI side, mirrored by matching types/interfaces in the backend's API client.</w:t>
       </w:r>
     </w:p>
     <w:p>
@@ -3436,39 +2614,7 @@
         <w:spacing w:after="80" w:line="290" w:lineRule="auto"/>
       </w:pPr>
       <w:r>
-        <w:t xml:space="preserve">Consistent error format on both services: </w:t>
-      </w:r>
-      <w:proofErr w:type="gramStart"/>
-      <w:r>
-        <w:t xml:space="preserve">{ </w:t>
-      </w:r>
-      <w:proofErr w:type="spellStart"/>
-      <w:r>
-        <w:t>error</w:t>
-      </w:r>
-      <w:proofErr w:type="gramEnd"/>
-      <w:r>
-        <w:t>_code</w:t>
-      </w:r>
-      <w:proofErr w:type="spellEnd"/>
-      <w:r>
-        <w:t xml:space="preserve">, message, </w:t>
-      </w:r>
-      <w:proofErr w:type="spellStart"/>
-      <w:r>
-        <w:t>request_</w:t>
-      </w:r>
-      <w:proofErr w:type="gramStart"/>
-      <w:r>
-        <w:t>id</w:t>
-      </w:r>
-      <w:proofErr w:type="spellEnd"/>
-      <w:r>
-        <w:t xml:space="preserve"> }</w:t>
-      </w:r>
-      <w:proofErr w:type="gramEnd"/>
-      <w:r>
-        <w:t>.</w:t>
+        <w:t>Consistent error format on both services: { error_code, message, request_id }.</w:t>
       </w:r>
     </w:p>
     <w:p>
@@ -3520,7 +2666,6 @@
         <w:spacing w:after="80" w:line="290" w:lineRule="auto"/>
       </w:pPr>
       <w:r>
-        <w:lastRenderedPageBreak/>
         <w:t>Environment-based configuration (.env) for both services; no secrets committed to either repository.</w:t>
       </w:r>
     </w:p>
@@ -3553,31 +2698,7 @@
         <w:spacing w:after="80" w:line="290" w:lineRule="auto"/>
       </w:pPr>
       <w:r>
-        <w:t xml:space="preserve">Python 3.11+, </w:t>
-      </w:r>
-      <w:proofErr w:type="spellStart"/>
-      <w:r>
-        <w:t>FastAPI</w:t>
-      </w:r>
-      <w:proofErr w:type="spellEnd"/>
-      <w:r>
-        <w:t xml:space="preserve">, </w:t>
-      </w:r>
-      <w:proofErr w:type="spellStart"/>
-      <w:r>
-        <w:t>Uvicorn</w:t>
-      </w:r>
-      <w:proofErr w:type="spellEnd"/>
-      <w:r>
-        <w:t xml:space="preserve"> (ASGI server), </w:t>
-      </w:r>
-      <w:proofErr w:type="spellStart"/>
-      <w:r>
-        <w:t>Pydantic</w:t>
-      </w:r>
-      <w:proofErr w:type="spellEnd"/>
-      <w:r>
-        <w:t xml:space="preserve"> v2.</w:t>
+        <w:t>Python — proposed baseline 3.11+; exact version pending Team Lead decision.</w:t>
       </w:r>
     </w:p>
     <w:p>
@@ -3590,7 +2711,7 @@
         <w:spacing w:after="80" w:line="290" w:lineRule="auto"/>
       </w:pPr>
       <w:r>
-        <w:t>An HTTP client on the backend side to call the AI service (e.g. the backend framework's own fetch/HTTP client).</w:t>
+        <w:t>Package manager — proposed (pip + requirements.txt, or Poetry); not yet finalized, pending Team Lead decision.</w:t>
       </w:r>
     </w:p>
     <w:p>
@@ -3603,7 +2724,7 @@
         <w:spacing w:after="80" w:line="290" w:lineRule="auto"/>
       </w:pPr>
       <w:r>
-        <w:t>Model dependencies: scikit-learn / transformers if self-hosted, or an LLM provider SDK if using an external API — final choice pending (see Section 10).</w:t>
+        <w:t>FastAPI, Uvicorn (ASGI server), and Pydantic v2 as the core web/service framework — proposed dependencies.</w:t>
       </w:r>
     </w:p>
     <w:p>
@@ -3616,15 +2737,7 @@
         <w:spacing w:after="80" w:line="290" w:lineRule="auto"/>
       </w:pPr>
       <w:r>
-        <w:t xml:space="preserve">Docker, for containerized deployment consistent with the rest of the </w:t>
-      </w:r>
-      <w:proofErr w:type="spellStart"/>
-      <w:r>
-        <w:t>Hisabdo</w:t>
-      </w:r>
-      <w:proofErr w:type="spellEnd"/>
-      <w:r>
-        <w:t xml:space="preserve"> stack.</w:t>
+        <w:t>An HTTP client on the backend side to call the AI service (e.g. the backend framework's own fetch/HTTP client).</w:t>
       </w:r>
     </w:p>
     <w:p>
@@ -3636,13 +2749,8 @@
         </w:numPr>
         <w:spacing w:after="80" w:line="290" w:lineRule="auto"/>
       </w:pPr>
-      <w:proofErr w:type="spellStart"/>
-      <w:r>
-        <w:t>pytest</w:t>
-      </w:r>
-      <w:proofErr w:type="spellEnd"/>
-      <w:r>
-        <w:t xml:space="preserve"> for AI-service unit and integration tests.</w:t>
+      <w:r>
+        <w:t>Model dependencies: scikit-learn / transformers if self-hosted, or an LLM provider SDK if using an external API — final choice pending (see Section 10).</w:t>
       </w:r>
     </w:p>
     <w:p>
@@ -3654,31 +2762,34 @@
         </w:numPr>
         <w:spacing w:after="80" w:line="290" w:lineRule="auto"/>
       </w:pPr>
-      <w:proofErr w:type="spellStart"/>
-      <w:r>
-        <w:t>FastAPI's</w:t>
-      </w:r>
-      <w:proofErr w:type="spellEnd"/>
-      <w:r>
-        <w:t xml:space="preserve"> auto-generated </w:t>
-      </w:r>
-      <w:proofErr w:type="spellStart"/>
-      <w:r>
-        <w:t>OpenAPI</w:t>
-      </w:r>
-      <w:proofErr w:type="spellEnd"/>
-      <w:r>
-        <w:t xml:space="preserve"> schema (/docs, /</w:t>
-      </w:r>
-      <w:proofErr w:type="spellStart"/>
-      <w:proofErr w:type="gramStart"/>
-      <w:r>
-        <w:t>openapi.json</w:t>
-      </w:r>
-      <w:proofErr w:type="spellEnd"/>
-      <w:proofErr w:type="gramEnd"/>
-      <w:r>
-        <w:t>) as the single source of truth for the backend integration contract.</w:t>
+      <w:r>
+        <w:t>Docker, for containerized deployment — proposed approach; final deployment/hosting strategy pending Team Lead decision.</w:t>
+      </w:r>
+    </w:p>
+    <w:p>
+      <w:pPr>
+        <w:pStyle w:val="ListParagraph"/>
+        <w:numPr>
+          <w:ilvl w:val="0"/>
+          <w:numId w:val="2"/>
+        </w:numPr>
+        <w:spacing w:after="80" w:line="290" w:lineRule="auto"/>
+      </w:pPr>
+      <w:r>
+        <w:t>pytest for AI-service unit and integration tests.</w:t>
+      </w:r>
+    </w:p>
+    <w:p>
+      <w:pPr>
+        <w:pStyle w:val="ListParagraph"/>
+        <w:numPr>
+          <w:ilvl w:val="0"/>
+          <w:numId w:val="2"/>
+        </w:numPr>
+        <w:spacing w:after="80" w:line="290" w:lineRule="auto"/>
+      </w:pPr>
+      <w:r>
+        <w:t>FastAPI's auto-generated OpenAPI schema (/docs, /openapi.json) as the single source of truth for the backend integration contract.</w:t>
       </w:r>
     </w:p>
     <w:p>
@@ -3722,12 +2833,6 @@
         <w:gridCol w:w="5270"/>
       </w:tblGrid>
       <w:tr>
-        <w:tblPrEx>
-          <w:tblCellMar>
-            <w:top w:w="0" w:type="dxa"/>
-            <w:bottom w:w="0" w:type="dxa"/>
-          </w:tblCellMar>
-        </w:tblPrEx>
         <w:tc>
           <w:tcPr>
             <w:tcW w:w="4270" w:type="dxa"/>
@@ -3780,15 +2885,10 @@
         </w:tc>
       </w:tr>
       <w:tr>
-        <w:tblPrEx>
-          <w:tblCellMar>
-            <w:top w:w="0" w:type="dxa"/>
-            <w:bottom w:w="0" w:type="dxa"/>
-          </w:tblCellMar>
-        </w:tblPrEx>
         <w:tc>
           <w:tcPr>
             <w:tcW w:w="4270" w:type="dxa"/>
+            <w:shd w:val="clear" w:color="auto" w:fill="F6F7FA"/>
             <w:tcMar>
               <w:top w:w="80" w:type="dxa"/>
               <w:left w:w="110" w:type="dxa"/>
@@ -3805,39 +2905,80 @@
                 <w:sz w:val="19"/>
                 <w:szCs w:val="19"/>
               </w:rPr>
-              <w:t>PR target branch &amp; merge ownership not yet confirmed by Team Leads</w:t>
+              <w:t>Chatbot LLM provider not selected (self-hosted vs external API)</w:t>
             </w:r>
           </w:p>
         </w:tc>
         <w:tc>
           <w:tcPr>
             <w:tcW w:w="5270" w:type="dxa"/>
-            <w:tcMar>
-              <w:top w:w="80" w:type="dxa"/>
-              <w:left w:w="110" w:type="dxa"/>
-              <w:bottom w:w="80" w:type="dxa"/>
-              <w:right w:w="110" w:type="dxa"/>
-            </w:tcMar>
-            <w:vAlign w:val="center"/>
-          </w:tcPr>
-          <w:p>
-            <w:r>
-              <w:rPr>
-                <w:sz w:val="19"/>
-                <w:szCs w:val="19"/>
-              </w:rPr>
-              <w:t>Cannot open/merge a final PR against the correct branch until confirmed — per the docs-branch clarification note in the workflow</w:t>
+            <w:shd w:val="clear" w:color="auto" w:fill="F6F7FA"/>
+            <w:tcMar>
+              <w:top w:w="80" w:type="dxa"/>
+              <w:left w:w="110" w:type="dxa"/>
+              <w:bottom w:w="80" w:type="dxa"/>
+              <w:right w:w="110" w:type="dxa"/>
+            </w:tcMar>
+            <w:vAlign w:val="center"/>
+          </w:tcPr>
+          <w:p>
+            <w:r>
+              <w:rPr>
+                <w:sz w:val="19"/>
+                <w:szCs w:val="19"/>
+              </w:rPr>
+              <w:t>Affects dependency list, latency, cost, and the external-provider box in the integration diagram</w:t>
             </w:r>
           </w:p>
         </w:tc>
       </w:tr>
       <w:tr>
-        <w:tblPrEx>
-          <w:tblCellMar>
-            <w:top w:w="0" w:type="dxa"/>
-            <w:bottom w:w="0" w:type="dxa"/>
-          </w:tblCellMar>
-        </w:tblPrEx>
+        <w:tc>
+          <w:tcPr>
+            <w:tcW w:w="4270" w:type="dxa"/>
+            <w:tcMar>
+              <w:top w:w="80" w:type="dxa"/>
+              <w:left w:w="110" w:type="dxa"/>
+              <w:bottom w:w="80" w:type="dxa"/>
+              <w:right w:w="110" w:type="dxa"/>
+            </w:tcMar>
+            <w:vAlign w:val="center"/>
+          </w:tcPr>
+          <w:p>
+            <w:r>
+              <w:rPr>
+                <w:b/>
+                <w:bCs/>
+                <w:sz w:val="19"/>
+                <w:szCs w:val="19"/>
+              </w:rPr>
+              <w:t>Final production categorization approach not yet decided (POC/baseline exists)</w:t>
+            </w:r>
+          </w:p>
+        </w:tc>
+        <w:tc>
+          <w:tcPr>
+            <w:tcW w:w="5270" w:type="dxa"/>
+            <w:tcMar>
+              <w:top w:w="80" w:type="dxa"/>
+              <w:left w:w="110" w:type="dxa"/>
+              <w:bottom w:w="80" w:type="dxa"/>
+              <w:right w:w="110" w:type="dxa"/>
+            </w:tcMar>
+            <w:vAlign w:val="center"/>
+          </w:tcPr>
+          <w:p>
+            <w:r>
+              <w:rPr>
+                <w:sz w:val="19"/>
+                <w:szCs w:val="19"/>
+              </w:rPr>
+              <w:t>POC/baseline results inform direction, but the production approach (rule-based vs ML vs hybrid) still needs sign-off before Section 6.2 moves beyond the baseline</w:t>
+            </w:r>
+          </w:p>
+        </w:tc>
+      </w:tr>
+      <w:tr>
         <w:tc>
           <w:tcPr>
             <w:tcW w:w="4270" w:type="dxa"/>
@@ -3858,7 +2999,7 @@
                 <w:sz w:val="19"/>
                 <w:szCs w:val="19"/>
               </w:rPr>
-              <w:t>Chatbot LLM provider not selected (self-hosted vs external API)</w:t>
+              <w:t>No approved/production-grade labeled dataset yet for expense categorization</w:t>
             </w:r>
           </w:p>
         </w:tc>
@@ -3880,18 +3021,12 @@
                 <w:sz w:val="19"/>
                 <w:szCs w:val="19"/>
               </w:rPr>
-              <w:t>Affects dependency list, latency, cost, and the external-provider box in the integration diagram</w:t>
+              <w:t>Only ad hoc/POC data available so far; blocks training and validating the final production categorization model</w:t>
             </w:r>
           </w:p>
         </w:tc>
       </w:tr>
       <w:tr>
-        <w:tblPrEx>
-          <w:tblCellMar>
-            <w:top w:w="0" w:type="dxa"/>
-            <w:bottom w:w="0" w:type="dxa"/>
-          </w:tblCellMar>
-        </w:tblPrEx>
         <w:tc>
           <w:tcPr>
             <w:tcW w:w="4270" w:type="dxa"/>
@@ -3911,7 +3046,7 @@
                 <w:sz w:val="19"/>
                 <w:szCs w:val="19"/>
               </w:rPr>
-              <w:t>Categorization approach not finalized (rule-based vs ML classifier)</w:t>
+              <w:t>Service-to-service auth mechanism (API key vs JWT) not decided</w:t>
             </w:r>
           </w:p>
         </w:tc>
@@ -3932,18 +3067,12 @@
                 <w:sz w:val="19"/>
                 <w:szCs w:val="19"/>
               </w:rPr>
-              <w:t>Affects section 6.2 implementation plan and required training data</w:t>
+              <w:t>Needs sign-off from whoever owns the backend repo; AI repo alone can't finalize it</w:t>
             </w:r>
           </w:p>
         </w:tc>
       </w:tr>
       <w:tr>
-        <w:tblPrEx>
-          <w:tblCellMar>
-            <w:top w:w="0" w:type="dxa"/>
-            <w:bottom w:w="0" w:type="dxa"/>
-          </w:tblCellMar>
-        </w:tblPrEx>
         <w:tc>
           <w:tcPr>
             <w:tcW w:w="4270" w:type="dxa"/>
@@ -3964,7 +3093,7 @@
                 <w:sz w:val="19"/>
                 <w:szCs w:val="19"/>
               </w:rPr>
-              <w:t>No confirmed labeled data for expense categorization</w:t>
+              <w:t>Deployment target (same network as backend vs separate service) unconfirmed</w:t>
             </w:r>
           </w:p>
         </w:tc>
@@ -3986,18 +3115,12 @@
                 <w:sz w:val="19"/>
                 <w:szCs w:val="19"/>
               </w:rPr>
-              <w:t>Blocks real implementation of the categorization model</w:t>
+              <w:t>Affects the network-boundary assumption used in Section 8</w:t>
             </w:r>
           </w:p>
         </w:tc>
       </w:tr>
       <w:tr>
-        <w:tblPrEx>
-          <w:tblCellMar>
-            <w:top w:w="0" w:type="dxa"/>
-            <w:bottom w:w="0" w:type="dxa"/>
-          </w:tblCellMar>
-        </w:tblPrEx>
         <w:tc>
           <w:tcPr>
             <w:tcW w:w="4270" w:type="dxa"/>
@@ -4017,7 +3140,7 @@
                 <w:sz w:val="19"/>
                 <w:szCs w:val="19"/>
               </w:rPr>
-              <w:t>Service-to-service auth mechanism (API key vs JWT) not decided</w:t>
+              <w:t>Final backend data contract for exact user financial queries not yet defined</w:t>
             </w:r>
           </w:p>
         </w:tc>
@@ -4038,61 +3161,7 @@
                 <w:sz w:val="19"/>
                 <w:szCs w:val="19"/>
               </w:rPr>
-              <w:t>Needs sign-off from whoever owns the backend repo; AI repo alone can't finalize it</w:t>
-            </w:r>
-          </w:p>
-        </w:tc>
-      </w:tr>
-      <w:tr>
-        <w:tblPrEx>
-          <w:tblCellMar>
-            <w:top w:w="0" w:type="dxa"/>
-            <w:bottom w:w="0" w:type="dxa"/>
-          </w:tblCellMar>
-        </w:tblPrEx>
-        <w:tc>
-          <w:tcPr>
-            <w:tcW w:w="4270" w:type="dxa"/>
-            <w:shd w:val="clear" w:color="auto" w:fill="F6F7FA"/>
-            <w:tcMar>
-              <w:top w:w="80" w:type="dxa"/>
-              <w:left w:w="110" w:type="dxa"/>
-              <w:bottom w:w="80" w:type="dxa"/>
-              <w:right w:w="110" w:type="dxa"/>
-            </w:tcMar>
-            <w:vAlign w:val="center"/>
-          </w:tcPr>
-          <w:p>
-            <w:r>
-              <w:rPr>
-                <w:b/>
-                <w:bCs/>
-                <w:sz w:val="19"/>
-                <w:szCs w:val="19"/>
-              </w:rPr>
-              <w:t>Deployment target (same network as backend vs separate service) unconfirmed</w:t>
-            </w:r>
-          </w:p>
-        </w:tc>
-        <w:tc>
-          <w:tcPr>
-            <w:tcW w:w="5270" w:type="dxa"/>
-            <w:shd w:val="clear" w:color="auto" w:fill="F6F7FA"/>
-            <w:tcMar>
-              <w:top w:w="80" w:type="dxa"/>
-              <w:left w:w="110" w:type="dxa"/>
-              <w:bottom w:w="80" w:type="dxa"/>
-              <w:right w:w="110" w:type="dxa"/>
-            </w:tcMar>
-            <w:vAlign w:val="center"/>
-          </w:tcPr>
-          <w:p>
-            <w:r>
-              <w:rPr>
-                <w:sz w:val="19"/>
-                <w:szCs w:val="19"/>
-              </w:rPr>
-              <w:t>Affects the network-boundary assumption used in Section 8</w:t>
+              <w:t>Blocks locking the API contract the AI service will call for authoritative values (balance, expenses, revenue, outstanding, etc. — see Section 6.1 data boundary)</w:t>
             </w:r>
           </w:p>
         </w:tc>
@@ -4669,6 +3738,7 @@
   <w:style w:type="paragraph" w:default="1" w:styleId="Normal">
     <w:name w:val="Normal"/>
     <w:qFormat/>
+    <w:rsid w:val="003C1914"/>
   </w:style>
   <w:style w:type="paragraph" w:styleId="Heading1">
     <w:name w:val="heading 1"/>

</xml_diff>

<commit_message>
Update Day 15 AI service architecture
</commit_message>
<xml_diff>
--- a/docs/Day15_AI_Service_Architecture.docx
+++ b/docs/Day15_AI_Service_Architecture.docx
@@ -1,6 +1,6 @@
 
 <file path=word/document.xml><?xml version="1.0" encoding="utf-8"?>
-<w:document xmlns:wpc="http://schemas.microsoft.com/office/word/2010/wordprocessingCanvas" xmlns:cx="http://schemas.microsoft.com/office/drawing/2014/chartex" xmlns:cx1="http://schemas.microsoft.com/office/drawing/2015/9/8/chartex" xmlns:cx2="http://schemas.microsoft.com/office/drawing/2015/10/21/chartex" xmlns:cx3="http://schemas.microsoft.com/office/drawing/2016/5/9/chartex" xmlns:cx4="http://schemas.microsoft.com/office/drawing/2016/5/10/chartex" xmlns:cx5="http://schemas.microsoft.com/office/drawing/2016/5/11/chartex" xmlns:cx6="http://schemas.microsoft.com/office/drawing/2016/5/12/chartex" xmlns:cx7="http://schemas.microsoft.com/office/drawing/2016/5/13/chartex" xmlns:cx8="http://schemas.microsoft.com/office/drawing/2016/5/14/chartex" xmlns:mc="http://schemas.openxmlformats.org/markup-compatibility/2006" xmlns:aink="http://schemas.microsoft.com/office/drawing/2016/ink" xmlns:am3d="http://schemas.microsoft.com/office/drawing/2017/model3d" xmlns:o="urn:schemas-microsoft-com:office:office" xmlns:oel="http://schemas.microsoft.com/office/2019/extlst" xmlns:r="http://schemas.openxmlformats.org/officeDocument/2006/relationships" xmlns:m="http://schemas.openxmlformats.org/officeDocument/2006/math" xmlns:v="urn:schemas-microsoft-com:vml" xmlns:wp14="http://schemas.microsoft.com/office/word/2010/wordprocessingDrawing" xmlns:wp="http://schemas.openxmlformats.org/drawingml/2006/wordprocessingDrawing" xmlns:w10="urn:schemas-microsoft-com:office:word" xmlns:w="http://schemas.openxmlformats.org/wordprocessingml/2006/main" xmlns:w14="http://schemas.microsoft.com/office/word/2010/wordml" xmlns:w15="http://schemas.microsoft.com/office/word/2012/wordml" xmlns:w16cei="http://schemas.microsoft.com/office/word/2026/wordml/cei" xmlns:w16cex="http://schemas.microsoft.com/office/word/2018/wordml/cex" xmlns:w16cid="http://schemas.microsoft.com/office/word/2016/wordml/cid" xmlns:w16="http://schemas.microsoft.com/office/word/2018/wordml" xmlns:w16du="http://schemas.microsoft.com/office/word/2023/wordml/word16du" xmlns:w16sdtdh="http://schemas.microsoft.com/office/word/2020/wordml/sdtdatahash" xmlns:w16sdtfl="http://schemas.microsoft.com/office/word/2024/wordml/sdtformatlock" xmlns:w16se="http://schemas.microsoft.com/office/word/2015/wordml/symex" xmlns:wpg="http://schemas.microsoft.com/office/word/2010/wordprocessingGroup" xmlns:wpi="http://schemas.microsoft.com/office/word/2010/wordprocessingInk" xmlns:wne="http://schemas.microsoft.com/office/word/2006/wordml" xmlns:wps="http://schemas.microsoft.com/office/word/2010/wordprocessingShape" mc:Ignorable="w14 w15 w16se w16cid w16 w16cex w16sdtdh w16sdtfl w16du wp14">
+<w:document xmlns:wpc="http://schemas.microsoft.com/office/word/2010/wordprocessingCanvas" xmlns:cx="http://schemas.microsoft.com/office/drawing/2014/chartex" xmlns:cx1="http://schemas.microsoft.com/office/drawing/2015/9/8/chartex" xmlns:cx2="http://schemas.microsoft.com/office/drawing/2015/10/21/chartex" xmlns:cx3="http://schemas.microsoft.com/office/drawing/2016/5/9/chartex" xmlns:cx4="http://schemas.microsoft.com/office/drawing/2016/5/10/chartex" xmlns:cx5="http://schemas.microsoft.com/office/drawing/2016/5/11/chartex" xmlns:cx6="http://schemas.microsoft.com/office/drawing/2016/5/12/chartex" xmlns:cx7="http://schemas.microsoft.com/office/drawing/2016/5/13/chartex" xmlns:cx8="http://schemas.microsoft.com/office/drawing/2016/5/14/chartex" xmlns:mc="http://schemas.openxmlformats.org/markup-compatibility/2006" xmlns:aink="http://schemas.microsoft.com/office/drawing/2016/ink" xmlns:am3d="http://schemas.microsoft.com/office/drawing/2017/model3d" xmlns:o="urn:schemas-microsoft-com:office:office" xmlns:oel="http://schemas.microsoft.com/office/2019/extlst" xmlns:r="http://schemas.openxmlformats.org/officeDocument/2006/relationships" xmlns:m="http://schemas.openxmlformats.org/officeDocument/2006/math" xmlns:v="urn:schemas-microsoft-com:vml" xmlns:wp14="http://schemas.microsoft.com/office/word/2010/wordprocessingDrawing" xmlns:wp="http://schemas.openxmlformats.org/drawingml/2006/wordprocessingDrawing" xmlns:w10="urn:schemas-microsoft-com:office:word" xmlns:w="http://schemas.openxmlformats.org/wordprocessingml/2006/main" xmlns:w14="http://schemas.microsoft.com/office/word/2010/wordml" xmlns:w15="http://schemas.microsoft.com/office/word/2012/wordml" xmlns:w16cex="http://schemas.microsoft.com/office/word/2018/wordml/cex" xmlns:w16cid="http://schemas.microsoft.com/office/word/2016/wordml/cid" xmlns:w16="http://schemas.microsoft.com/office/word/2018/wordml" xmlns:w16du="http://schemas.microsoft.com/office/word/2023/wordml/word16du" xmlns:w16sdtdh="http://schemas.microsoft.com/office/word/2020/wordml/sdtdatahash" xmlns:w16sdtfl="http://schemas.microsoft.com/office/word/2024/wordml/sdtformatlock" xmlns:w16se="http://schemas.microsoft.com/office/word/2015/wordml/symex" xmlns:wpg="http://schemas.microsoft.com/office/word/2010/wordprocessingGroup" xmlns:wpi="http://schemas.microsoft.com/office/word/2010/wordprocessingInk" xmlns:wne="http://schemas.microsoft.com/office/word/2006/wordml" xmlns:wps="http://schemas.microsoft.com/office/word/2010/wordprocessingShape" mc:Ignorable="w14 w15 w16se w16cid w16 w16cex w16sdtdh w16sdtfl w16du wp14">
   <w:body>
     <w:p>
       <w:pPr>
@@ -491,15 +491,20 @@
         <w:spacing w:after="80" w:line="290" w:lineRule="auto"/>
       </w:pPr>
       <w:r>
-        <w:t xml:space="preserve">The model/provider choice for the chatbot (self-hosted vs. external LLM API) is not yet finalized; both paths are accounted for in </w:t>
-      </w:r>
-      <w:proofErr w:type="gramStart"/>
-      <w:r>
-        <w:t>the dependency</w:t>
-      </w:r>
-      <w:proofErr w:type="gramEnd"/>
-      <w:r>
-        <w:t xml:space="preserve"> and blocker lists below.</w:t>
+        <w:t>our current Team Lead workflow is feature branch → PR to main (internal workflow, not management policy).</w:t>
+      </w:r>
+    </w:p>
+    <w:p>
+      <w:pPr>
+        <w:pStyle w:val="ListParagraph"/>
+        <w:numPr>
+          <w:ilvl w:val="0"/>
+          <w:numId w:val="2"/>
+        </w:numPr>
+        <w:spacing w:after="80" w:line="290" w:lineRule="auto"/>
+      </w:pPr>
+      <w:r>
+        <w:t>The model/provider choice for the chatbot (self-hosted vs. external LLM API) is not yet finalized; both paths are accounted for in the dependency and blocker lists below.</w:t>
       </w:r>
     </w:p>
     <w:p>
@@ -673,9 +678,6 @@
     </w:p>
     <w:p>
       <w:pPr>
-        <w:tabs>
-          <w:tab w:val="left" w:pos="6240"/>
-        </w:tabs>
         <w:spacing w:after="20"/>
       </w:pPr>
       <w:r>
@@ -686,15 +688,6 @@
           <w:szCs w:val="18"/>
         </w:rPr>
         <w:t>│── tests</w:t>
-      </w:r>
-      <w:r>
-        <w:rPr>
-          <w:rFonts w:ascii="Consolas" w:eastAsia="Consolas" w:hAnsi="Consolas" w:cs="Consolas"/>
-          <w:color w:val="1B2430"/>
-          <w:sz w:val="18"/>
-          <w:szCs w:val="18"/>
-        </w:rPr>
-        <w:tab/>
       </w:r>
     </w:p>
     <w:p>
@@ -914,6 +907,7 @@
           <w:sz w:val="27"/>
           <w:szCs w:val="27"/>
         </w:rPr>
+        <w:lastRenderedPageBreak/>
         <w:t>4. FastAPI Service &amp; Endpoint Planning</w:t>
       </w:r>
     </w:p>
@@ -922,7 +916,6 @@
         <w:spacing w:after="160" w:line="300" w:lineRule="auto"/>
       </w:pPr>
       <w:r>
-        <w:lastRenderedPageBreak/>
         <w:t>All endpoints are versioned under /api/v1 so the contract with the backend can evolve without breaking existing integrations.</w:t>
       </w:r>
     </w:p>
@@ -2291,6 +2284,7 @@
           <w:sz w:val="20"/>
           <w:szCs w:val="20"/>
         </w:rPr>
+        <w:lastRenderedPageBreak/>
         <w:t xml:space="preserve">Input: </w:t>
       </w:r>
       <w:r>
@@ -2313,7 +2307,6 @@
           <w:sz w:val="20"/>
           <w:szCs w:val="20"/>
         </w:rPr>
-        <w:lastRenderedPageBreak/>
         <w:t xml:space="preserve">Processing: </w:t>
       </w:r>
       <w:r>
@@ -3183,7 +3176,7 @@
 </file>
 
 <file path=word/numbering.xml><?xml version="1.0" encoding="utf-8"?>
-<w:numbering xmlns:wpc="http://schemas.microsoft.com/office/word/2010/wordprocessingCanvas" xmlns:cx="http://schemas.microsoft.com/office/drawing/2014/chartex" xmlns:cx1="http://schemas.microsoft.com/office/drawing/2015/9/8/chartex" xmlns:cx2="http://schemas.microsoft.com/office/drawing/2015/10/21/chartex" xmlns:cx3="http://schemas.microsoft.com/office/drawing/2016/5/9/chartex" xmlns:cx4="http://schemas.microsoft.com/office/drawing/2016/5/10/chartex" xmlns:cx5="http://schemas.microsoft.com/office/drawing/2016/5/11/chartex" xmlns:cx6="http://schemas.microsoft.com/office/drawing/2016/5/12/chartex" xmlns:cx7="http://schemas.microsoft.com/office/drawing/2016/5/13/chartex" xmlns:cx8="http://schemas.microsoft.com/office/drawing/2016/5/14/chartex" xmlns:mc="http://schemas.openxmlformats.org/markup-compatibility/2006" xmlns:aink="http://schemas.microsoft.com/office/drawing/2016/ink" xmlns:am3d="http://schemas.microsoft.com/office/drawing/2017/model3d" xmlns:o="urn:schemas-microsoft-com:office:office" xmlns:oel="http://schemas.microsoft.com/office/2019/extlst" xmlns:r="http://schemas.openxmlformats.org/officeDocument/2006/relationships" xmlns:m="http://schemas.openxmlformats.org/officeDocument/2006/math" xmlns:v="urn:schemas-microsoft-com:vml" xmlns:wp14="http://schemas.microsoft.com/office/word/2010/wordprocessingDrawing" xmlns:wp="http://schemas.openxmlformats.org/drawingml/2006/wordprocessingDrawing" xmlns:w10="urn:schemas-microsoft-com:office:word" xmlns:w="http://schemas.openxmlformats.org/wordprocessingml/2006/main" xmlns:w14="http://schemas.microsoft.com/office/word/2010/wordml" xmlns:w15="http://schemas.microsoft.com/office/word/2012/wordml" xmlns:w16cei="http://schemas.microsoft.com/office/word/2026/wordml/cei" xmlns:w16cex="http://schemas.microsoft.com/office/word/2018/wordml/cex" xmlns:w16cid="http://schemas.microsoft.com/office/word/2016/wordml/cid" xmlns:w16="http://schemas.microsoft.com/office/word/2018/wordml" xmlns:w16du="http://schemas.microsoft.com/office/word/2023/wordml/word16du" xmlns:w16sdtdh="http://schemas.microsoft.com/office/word/2020/wordml/sdtdatahash" xmlns:w16sdtfl="http://schemas.microsoft.com/office/word/2024/wordml/sdtformatlock" xmlns:w16se="http://schemas.microsoft.com/office/word/2015/wordml/symex" xmlns:wpg="http://schemas.microsoft.com/office/word/2010/wordprocessingGroup" xmlns:wpi="http://schemas.microsoft.com/office/word/2010/wordprocessingInk" xmlns:wne="http://schemas.microsoft.com/office/word/2006/wordml" xmlns:wps="http://schemas.microsoft.com/office/word/2010/wordprocessingShape" mc:Ignorable="w14 w15 w16se w16cid w16 w16cex w16sdtdh w16sdtfl w16du wp14">
+<w:numbering xmlns:wpc="http://schemas.microsoft.com/office/word/2010/wordprocessingCanvas" xmlns:cx="http://schemas.microsoft.com/office/drawing/2014/chartex" xmlns:cx1="http://schemas.microsoft.com/office/drawing/2015/9/8/chartex" xmlns:cx2="http://schemas.microsoft.com/office/drawing/2015/10/21/chartex" xmlns:cx3="http://schemas.microsoft.com/office/drawing/2016/5/9/chartex" xmlns:cx4="http://schemas.microsoft.com/office/drawing/2016/5/10/chartex" xmlns:cx5="http://schemas.microsoft.com/office/drawing/2016/5/11/chartex" xmlns:cx6="http://schemas.microsoft.com/office/drawing/2016/5/12/chartex" xmlns:cx7="http://schemas.microsoft.com/office/drawing/2016/5/13/chartex" xmlns:cx8="http://schemas.microsoft.com/office/drawing/2016/5/14/chartex" xmlns:mc="http://schemas.openxmlformats.org/markup-compatibility/2006" xmlns:aink="http://schemas.microsoft.com/office/drawing/2016/ink" xmlns:am3d="http://schemas.microsoft.com/office/drawing/2017/model3d" xmlns:o="urn:schemas-microsoft-com:office:office" xmlns:oel="http://schemas.microsoft.com/office/2019/extlst" xmlns:r="http://schemas.openxmlformats.org/officeDocument/2006/relationships" xmlns:m="http://schemas.openxmlformats.org/officeDocument/2006/math" xmlns:v="urn:schemas-microsoft-com:vml" xmlns:wp14="http://schemas.microsoft.com/office/word/2010/wordprocessingDrawing" xmlns:wp="http://schemas.openxmlformats.org/drawingml/2006/wordprocessingDrawing" xmlns:w10="urn:schemas-microsoft-com:office:word" xmlns:w="http://schemas.openxmlformats.org/wordprocessingml/2006/main" xmlns:w14="http://schemas.microsoft.com/office/word/2010/wordml" xmlns:w15="http://schemas.microsoft.com/office/word/2012/wordml" xmlns:w16cex="http://schemas.microsoft.com/office/word/2018/wordml/cex" xmlns:w16cid="http://schemas.microsoft.com/office/word/2016/wordml/cid" xmlns:w16="http://schemas.microsoft.com/office/word/2018/wordml" xmlns:w16du="http://schemas.microsoft.com/office/word/2023/wordml/word16du" xmlns:w16sdtdh="http://schemas.microsoft.com/office/word/2020/wordml/sdtdatahash" xmlns:w16sdtfl="http://schemas.microsoft.com/office/word/2024/wordml/sdtformatlock" xmlns:w16se="http://schemas.microsoft.com/office/word/2015/wordml/symex" xmlns:wpg="http://schemas.microsoft.com/office/word/2010/wordprocessingGroup" xmlns:wpi="http://schemas.microsoft.com/office/word/2010/wordprocessingInk" xmlns:wne="http://schemas.microsoft.com/office/word/2006/wordml" xmlns:wps="http://schemas.microsoft.com/office/word/2010/wordprocessingShape" mc:Ignorable="w14 w15 w16se w16cid w16 w16cex w16sdtdh w16sdtfl w16du wp14">
   <w:abstractNum w:abstractNumId="0" w15:restartNumberingAfterBreak="0">
     <w:nsid w:val="30FC761B"/>
     <w:multiLevelType w:val="hybridMultilevel"/>

</xml_diff>